<commit_message>
Update profile photo and optimize image rendering quality
</commit_message>
<xml_diff>
--- a/assets/Beni Makiese CV.docx
+++ b/assets/Beni Makiese CV.docx
@@ -21,7 +21,7 @@
         <mc:AlternateContent>
           <mc:Choice Requires="wps">
             <w:drawing>
-              <wp:anchor distT="0" distB="0" distL="114300" distR="114300" simplePos="0" relativeHeight="251642880" behindDoc="0" locked="0" layoutInCell="1" allowOverlap="1" wp14:anchorId="243362C3" wp14:editId="06F37A71">
+              <wp:anchor distT="0" distB="0" distL="114300" distR="114300" simplePos="0" relativeHeight="251642880" behindDoc="0" locked="0" layoutInCell="1" allowOverlap="1" wp14:anchorId="243362C3" wp14:editId="606C214A">
                 <wp:simplePos x="0" y="0"/>
                 <wp:positionH relativeFrom="column">
                   <wp:posOffset>-34290</wp:posOffset>
@@ -47,9 +47,7 @@
                           <a:avLst/>
                         </a:prstGeom>
                         <a:solidFill>
-                          <a:schemeClr val="bg1">
-                            <a:lumMod val="75000"/>
-                          </a:schemeClr>
+                          <a:srgbClr val="D9D9D9"/>
                         </a:solidFill>
                         <a:ln>
                           <a:noFill/>
@@ -88,7 +86,7 @@
           </mc:Choice>
           <mc:Fallback>
             <w:pict>
-              <v:rect w14:anchorId="7E8834A5" id="Rectangle 2" o:spid="_x0000_s1026" style="position:absolute;margin-left:-2.7pt;margin-top:-9.15pt;width:516.85pt;height:33.3pt;z-index:251642880;visibility:visible;mso-wrap-style:square;mso-height-percent:0;mso-wrap-distance-left:9pt;mso-wrap-distance-top:0;mso-wrap-distance-right:9pt;mso-wrap-distance-bottom:0;mso-position-horizontal:absolute;mso-position-horizontal-relative:text;mso-position-vertical:absolute;mso-position-vertical-relative:text;mso-height-percent:0;mso-height-relative:margin;v-text-anchor:middle" o:gfxdata="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" fillcolor="#bfbfbf [2412]" stroked="f" strokeweight="1pt"/>
+              <v:rect w14:anchorId="093FB9A1" id="Rectangle 2" o:spid="_x0000_s1026" style="position:absolute;margin-left:-2.7pt;margin-top:-9.15pt;width:516.85pt;height:33.3pt;z-index:251642880;visibility:visible;mso-wrap-style:square;mso-height-percent:0;mso-wrap-distance-left:9pt;mso-wrap-distance-top:0;mso-wrap-distance-right:9pt;mso-wrap-distance-bottom:0;mso-position-horizontal:absolute;mso-position-horizontal-relative:text;mso-position-vertical:absolute;mso-position-vertical-relative:text;mso-height-percent:0;mso-height-relative:margin;v-text-anchor:middle" o:gfxdata="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" fillcolor="#d9d9d9" stroked="f" strokeweight="1pt"/>
             </w:pict>
           </mc:Fallback>
         </mc:AlternateContent>
@@ -111,6 +109,74 @@
         <w:ind w:right="98"/>
         <w:jc w:val="right"/>
       </w:pPr>
+      <w:r>
+        <w:rPr>
+          <w:noProof/>
+          <w14:ligatures w14:val="standardContextual"/>
+        </w:rPr>
+        <w:drawing>
+          <wp:anchor distT="0" distB="0" distL="114300" distR="114300" simplePos="0" relativeHeight="251719680" behindDoc="1" locked="0" layoutInCell="1" allowOverlap="1" wp14:anchorId="222D8828" wp14:editId="3AB6C6F1">
+            <wp:simplePos x="0" y="0"/>
+            <wp:positionH relativeFrom="column">
+              <wp:posOffset>-137160</wp:posOffset>
+            </wp:positionH>
+            <wp:positionV relativeFrom="paragraph">
+              <wp:posOffset>222250</wp:posOffset>
+            </wp:positionV>
+            <wp:extent cx="2167890" cy="2114550"/>
+            <wp:effectExtent l="0" t="0" r="3810" b="0"/>
+            <wp:wrapNone/>
+            <wp:docPr id="1255105460" name="Image 1"/>
+            <wp:cNvGraphicFramePr>
+              <a:graphicFrameLocks xmlns:a="http://schemas.openxmlformats.org/drawingml/2006/main" noChangeAspect="1"/>
+            </wp:cNvGraphicFramePr>
+            <a:graphic xmlns:a="http://schemas.openxmlformats.org/drawingml/2006/main">
+              <a:graphicData uri="http://schemas.openxmlformats.org/drawingml/2006/picture">
+                <pic:pic xmlns:pic="http://schemas.openxmlformats.org/drawingml/2006/picture">
+                  <pic:nvPicPr>
+                    <pic:cNvPr id="1255105460" name="Image 1255105460"/>
+                    <pic:cNvPicPr/>
+                  </pic:nvPicPr>
+                  <pic:blipFill rotWithShape="1">
+                    <a:blip r:embed="rId5" cstate="print">
+                      <a:extLst>
+                        <a:ext uri="{28A0092B-C50C-407E-A947-70E740481C1C}">
+                          <a14:useLocalDpi xmlns:a14="http://schemas.microsoft.com/office/drawing/2010/main" val="0"/>
+                        </a:ext>
+                      </a:extLst>
+                    </a:blip>
+                    <a:srcRect l="7585" t="8840" b="35766"/>
+                    <a:stretch/>
+                  </pic:blipFill>
+                  <pic:spPr bwMode="auto">
+                    <a:xfrm>
+                      <a:off x="0" y="0"/>
+                      <a:ext cx="2167890" cy="2114550"/>
+                    </a:xfrm>
+                    <a:prstGeom prst="roundRect">
+                      <a:avLst/>
+                    </a:prstGeom>
+                    <a:ln>
+                      <a:noFill/>
+                    </a:ln>
+                    <a:extLst>
+                      <a:ext uri="{53640926-AAD7-44D8-BBD7-CCE9431645EC}">
+                        <a14:shadowObscured xmlns:a14="http://schemas.microsoft.com/office/drawing/2010/main"/>
+                      </a:ext>
+                    </a:extLst>
+                  </pic:spPr>
+                </pic:pic>
+              </a:graphicData>
+            </a:graphic>
+            <wp14:sizeRelH relativeFrom="margin">
+              <wp14:pctWidth>0</wp14:pctWidth>
+            </wp14:sizeRelH>
+            <wp14:sizeRelV relativeFrom="margin">
+              <wp14:pctHeight>0</wp14:pctHeight>
+            </wp14:sizeRelV>
+          </wp:anchor>
+        </w:drawing>
+      </w:r>
       <w:r>
         <w:rPr>
           <w:noProof/>
@@ -299,114 +365,6 @@
             </w:pict>
           </mc:Fallback>
         </mc:AlternateContent>
-      </w:r>
-      <w:r>
-        <w:rPr>
-          <w:noProof/>
-          <w:sz w:val="20"/>
-          <w14:ligatures w14:val="standardContextual"/>
-        </w:rPr>
-        <w:drawing>
-          <wp:anchor distT="0" distB="0" distL="114300" distR="114300" simplePos="0" relativeHeight="251691008" behindDoc="0" locked="0" layoutInCell="1" allowOverlap="1" wp14:anchorId="1DFCC5FB" wp14:editId="67CD50A4">
-            <wp:simplePos x="0" y="0"/>
-            <wp:positionH relativeFrom="column">
-              <wp:posOffset>-33655</wp:posOffset>
-            </wp:positionH>
-            <wp:positionV relativeFrom="paragraph">
-              <wp:posOffset>146050</wp:posOffset>
-            </wp:positionV>
-            <wp:extent cx="1821180" cy="2103755"/>
-            <wp:effectExtent l="0" t="0" r="7620" b="0"/>
-            <wp:wrapThrough wrapText="bothSides">
-              <wp:wrapPolygon edited="0">
-                <wp:start x="9038" y="0"/>
-                <wp:lineTo x="7230" y="196"/>
-                <wp:lineTo x="2711" y="2543"/>
-                <wp:lineTo x="2033" y="4107"/>
-                <wp:lineTo x="452" y="6259"/>
-                <wp:lineTo x="0" y="8215"/>
-                <wp:lineTo x="0" y="13105"/>
-                <wp:lineTo x="678" y="15647"/>
-                <wp:lineTo x="3163" y="18777"/>
-                <wp:lineTo x="3389" y="19364"/>
-                <wp:lineTo x="7908" y="21320"/>
-                <wp:lineTo x="9038" y="21320"/>
-                <wp:lineTo x="12427" y="21320"/>
-                <wp:lineTo x="13782" y="21320"/>
-                <wp:lineTo x="18075" y="19364"/>
-                <wp:lineTo x="18301" y="18777"/>
-                <wp:lineTo x="20787" y="15647"/>
-                <wp:lineTo x="21464" y="13105"/>
-                <wp:lineTo x="21464" y="8215"/>
-                <wp:lineTo x="21013" y="6259"/>
-                <wp:lineTo x="18979" y="2543"/>
-                <wp:lineTo x="14234" y="196"/>
-                <wp:lineTo x="12427" y="0"/>
-                <wp:lineTo x="9038" y="0"/>
-              </wp:wrapPolygon>
-            </wp:wrapThrough>
-            <wp:docPr id="1625797917" name="Image 1"/>
-            <wp:cNvGraphicFramePr>
-              <a:graphicFrameLocks xmlns:a="http://schemas.openxmlformats.org/drawingml/2006/main" noChangeAspect="1"/>
-            </wp:cNvGraphicFramePr>
-            <a:graphic xmlns:a="http://schemas.openxmlformats.org/drawingml/2006/main">
-              <a:graphicData uri="http://schemas.openxmlformats.org/drawingml/2006/picture">
-                <pic:pic xmlns:pic="http://schemas.openxmlformats.org/drawingml/2006/picture">
-                  <pic:nvPicPr>
-                    <pic:cNvPr id="1625797917" name="Image 1625797917"/>
-                    <pic:cNvPicPr/>
-                  </pic:nvPicPr>
-                  <pic:blipFill rotWithShape="1">
-                    <a:blip r:embed="rId5" cstate="print">
-                      <a:extLst>
-                        <a:ext uri="{BEBA8EAE-BF5A-486C-A8C5-ECC9F3942E4B}">
-                          <a14:imgProps xmlns:a14="http://schemas.microsoft.com/office/drawing/2010/main">
-                            <a14:imgLayer r:embed="rId6">
-                              <a14:imgEffect>
-                                <a14:saturation sat="0"/>
-                              </a14:imgEffect>
-                            </a14:imgLayer>
-                          </a14:imgProps>
-                        </a:ext>
-                        <a:ext uri="{28A0092B-C50C-407E-A947-70E740481C1C}">
-                          <a14:useLocalDpi xmlns:a14="http://schemas.microsoft.com/office/drawing/2010/main" val="0"/>
-                        </a:ext>
-                      </a:extLst>
-                    </a:blip>
-                    <a:srcRect l="22449" t="33843" r="15646" b="12517"/>
-                    <a:stretch/>
-                  </pic:blipFill>
-                  <pic:spPr bwMode="auto">
-                    <a:xfrm>
-                      <a:off x="0" y="0"/>
-                      <a:ext cx="1821180" cy="2103755"/>
-                    </a:xfrm>
-                    <a:prstGeom prst="flowChartConnector">
-                      <a:avLst/>
-                    </a:prstGeom>
-                    <a:ln>
-                      <a:noFill/>
-                    </a:ln>
-                    <a:effectLst>
-                      <a:softEdge rad="31750"/>
-                    </a:effectLst>
-                    <a:extLst>
-                      <a:ext uri="{53640926-AAD7-44D8-BBD7-CCE9431645EC}">
-                        <a14:shadowObscured xmlns:a14="http://schemas.microsoft.com/office/drawing/2010/main"/>
-                      </a:ext>
-                    </a:extLst>
-                  </pic:spPr>
-                </pic:pic>
-              </a:graphicData>
-            </a:graphic>
-            <wp14:sizeRelH relativeFrom="margin">
-              <wp14:pctWidth>0</wp14:pctWidth>
-            </wp14:sizeRelH>
-            <wp14:sizeRelV relativeFrom="margin">
-              <wp14:pctHeight>0</wp14:pctHeight>
-            </wp14:sizeRelV>
-          </wp:anchor>
-        </w:drawing>
       </w:r>
     </w:p>
     <w:p>
@@ -790,7 +748,7 @@
         <mc:AlternateContent>
           <mc:Choice Requires="wpg">
             <w:drawing>
-              <wp:anchor distT="0" distB="0" distL="114300" distR="114300" simplePos="0" relativeHeight="251653120" behindDoc="0" locked="0" layoutInCell="1" allowOverlap="1" wp14:anchorId="2AE8133A" wp14:editId="24CC46CA">
+              <wp:anchor distT="0" distB="0" distL="114300" distR="114300" simplePos="0" relativeHeight="251653120" behindDoc="0" locked="0" layoutInCell="1" allowOverlap="1" wp14:anchorId="2AE8133A" wp14:editId="4C9B9D5C">
                 <wp:simplePos x="0" y="0"/>
                 <wp:positionH relativeFrom="column">
                   <wp:posOffset>2132759</wp:posOffset>
@@ -2217,6 +2175,1827 @@
         <mc:AlternateContent>
           <mc:Choice Requires="wpg">
             <w:drawing>
+              <wp:anchor distT="0" distB="0" distL="114300" distR="114300" simplePos="0" relativeHeight="251689984" behindDoc="0" locked="0" layoutInCell="1" allowOverlap="1" wp14:anchorId="1918F670" wp14:editId="43A7E8B3">
+                <wp:simplePos x="0" y="0"/>
+                <wp:positionH relativeFrom="column">
+                  <wp:posOffset>-142875</wp:posOffset>
+                </wp:positionH>
+                <wp:positionV relativeFrom="paragraph">
+                  <wp:posOffset>5420995</wp:posOffset>
+                </wp:positionV>
+                <wp:extent cx="2186940" cy="1447800"/>
+                <wp:effectExtent l="0" t="0" r="22860" b="0"/>
+                <wp:wrapNone/>
+                <wp:docPr id="656231994" name="Groupe 3"/>
+                <wp:cNvGraphicFramePr/>
+                <a:graphic xmlns:a="http://schemas.openxmlformats.org/drawingml/2006/main">
+                  <a:graphicData uri="http://schemas.microsoft.com/office/word/2010/wordprocessingGroup">
+                    <wpg:wgp>
+                      <wpg:cNvGrpSpPr/>
+                      <wpg:grpSpPr>
+                        <a:xfrm>
+                          <a:off x="0" y="0"/>
+                          <a:ext cx="2186940" cy="1447800"/>
+                          <a:chOff x="0" y="0"/>
+                          <a:chExt cx="2186940" cy="1447800"/>
+                        </a:xfrm>
+                      </wpg:grpSpPr>
+                      <wps:wsp>
+                        <wps:cNvPr id="558982198" name="Zone de texte 2"/>
+                        <wps:cNvSpPr txBox="1">
+                          <a:spLocks noChangeArrowheads="1"/>
+                        </wps:cNvSpPr>
+                        <wps:spPr bwMode="auto">
+                          <a:xfrm>
+                            <a:off x="9525" y="0"/>
+                            <a:ext cx="1705610" cy="309880"/>
+                          </a:xfrm>
+                          <a:prstGeom prst="rect">
+                            <a:avLst/>
+                          </a:prstGeom>
+                          <a:noFill/>
+                          <a:ln w="9525">
+                            <a:noFill/>
+                            <a:miter lim="800000"/>
+                            <a:headEnd/>
+                            <a:tailEnd/>
+                          </a:ln>
+                        </wps:spPr>
+                        <wps:txbx>
+                          <w:txbxContent>
+                            <w:p>
+                              <w:pPr>
+                                <w:pStyle w:val="Corpsdetexte"/>
+                                <w:spacing w:before="101"/>
+                                <w:ind w:right="98"/>
+                                <w:rPr>
+                                  <w:rFonts w:ascii="Trebuchet MS"/>
+                                  <w:color w:val="262626" w:themeColor="text1" w:themeTint="D9"/>
+                                  <w:w w:val="95"/>
+                                  <w:sz w:val="20"/>
+                                  <w:szCs w:val="20"/>
+                                  <w:lang w:val="es-ES"/>
+                                </w:rPr>
+                              </w:pPr>
+                              <w:r>
+                                <w:rPr>
+                                  <w:rFonts w:ascii="Trebuchet MS"/>
+                                  <w:color w:val="262626" w:themeColor="text1" w:themeTint="D9"/>
+                                  <w:w w:val="95"/>
+                                  <w:sz w:val="20"/>
+                                  <w:szCs w:val="20"/>
+                                  <w:lang w:val="es-ES"/>
+                                </w:rPr>
+                                <w:t>CENTRES D</w:t>
+                              </w:r>
+                              <w:r>
+                                <w:rPr>
+                                  <w:rFonts w:ascii="Trebuchet MS"/>
+                                  <w:color w:val="262626" w:themeColor="text1" w:themeTint="D9"/>
+                                  <w:w w:val="95"/>
+                                  <w:sz w:val="20"/>
+                                  <w:szCs w:val="20"/>
+                                  <w:lang w:val="es-ES"/>
+                                </w:rPr>
+                                <w:t>’</w:t>
+                              </w:r>
+                              <w:r>
+                                <w:rPr>
+                                  <w:rFonts w:ascii="Trebuchet MS"/>
+                                  <w:color w:val="262626" w:themeColor="text1" w:themeTint="D9"/>
+                                  <w:w w:val="95"/>
+                                  <w:sz w:val="20"/>
+                                  <w:szCs w:val="20"/>
+                                  <w:lang w:val="es-ES"/>
+                                </w:rPr>
+                                <w:t>INT</w:t>
+                              </w:r>
+                              <w:r>
+                                <w:rPr>
+                                  <w:rFonts w:ascii="Trebuchet MS"/>
+                                  <w:color w:val="262626" w:themeColor="text1" w:themeTint="D9"/>
+                                  <w:w w:val="95"/>
+                                  <w:sz w:val="20"/>
+                                  <w:szCs w:val="20"/>
+                                  <w:lang w:val="es-ES"/>
+                                </w:rPr>
+                                <w:t>É</w:t>
+                              </w:r>
+                              <w:r>
+                                <w:rPr>
+                                  <w:rFonts w:ascii="Trebuchet MS"/>
+                                  <w:color w:val="262626" w:themeColor="text1" w:themeTint="D9"/>
+                                  <w:w w:val="95"/>
+                                  <w:sz w:val="20"/>
+                                  <w:szCs w:val="20"/>
+                                  <w:lang w:val="es-ES"/>
+                                </w:rPr>
+                                <w:t>R</w:t>
+                              </w:r>
+                              <w:r>
+                                <w:rPr>
+                                  <w:rFonts w:ascii="Trebuchet MS"/>
+                                  <w:color w:val="262626" w:themeColor="text1" w:themeTint="D9"/>
+                                  <w:w w:val="95"/>
+                                  <w:sz w:val="20"/>
+                                  <w:szCs w:val="20"/>
+                                  <w:lang w:val="es-ES"/>
+                                </w:rPr>
+                                <w:t>Ê</w:t>
+                              </w:r>
+                              <w:r>
+                                <w:rPr>
+                                  <w:rFonts w:ascii="Trebuchet MS"/>
+                                  <w:color w:val="262626" w:themeColor="text1" w:themeTint="D9"/>
+                                  <w:w w:val="95"/>
+                                  <w:sz w:val="20"/>
+                                  <w:szCs w:val="20"/>
+                                  <w:lang w:val="es-ES"/>
+                                </w:rPr>
+                                <w:t>T</w:t>
+                              </w:r>
+                            </w:p>
+                          </w:txbxContent>
+                        </wps:txbx>
+                        <wps:bodyPr rot="0" vert="horz" wrap="square" lIns="91440" tIns="45720" rIns="91440" bIns="45720" anchor="t" anchorCtr="0">
+                          <a:noAutofit/>
+                        </wps:bodyPr>
+                      </wps:wsp>
+                      <wps:wsp>
+                        <wps:cNvPr id="1657039949" name="Connecteur droit 3"/>
+                        <wps:cNvCnPr/>
+                        <wps:spPr>
+                          <a:xfrm>
+                            <a:off x="95250" y="314325"/>
+                            <a:ext cx="2076450" cy="0"/>
+                          </a:xfrm>
+                          <a:prstGeom prst="line">
+                            <a:avLst/>
+                          </a:prstGeom>
+                          <a:ln>
+                            <a:solidFill>
+                              <a:schemeClr val="bg1">
+                                <a:lumMod val="75000"/>
+                              </a:schemeClr>
+                            </a:solidFill>
+                          </a:ln>
+                        </wps:spPr>
+                        <wps:style>
+                          <a:lnRef idx="1">
+                            <a:schemeClr val="accent1"/>
+                          </a:lnRef>
+                          <a:fillRef idx="0">
+                            <a:schemeClr val="accent1"/>
+                          </a:fillRef>
+                          <a:effectRef idx="0">
+                            <a:schemeClr val="accent1"/>
+                          </a:effectRef>
+                          <a:fontRef idx="minor">
+                            <a:schemeClr val="tx1"/>
+                          </a:fontRef>
+                        </wps:style>
+                        <wps:bodyPr/>
+                      </wps:wsp>
+                      <wps:wsp>
+                        <wps:cNvPr id="1209884258" name="Connecteur droit 3"/>
+                        <wps:cNvCnPr/>
+                        <wps:spPr>
+                          <a:xfrm>
+                            <a:off x="104775" y="47625"/>
+                            <a:ext cx="2072640" cy="0"/>
+                          </a:xfrm>
+                          <a:prstGeom prst="line">
+                            <a:avLst/>
+                          </a:prstGeom>
+                          <a:ln>
+                            <a:solidFill>
+                              <a:schemeClr val="bg1">
+                                <a:lumMod val="75000"/>
+                              </a:schemeClr>
+                            </a:solidFill>
+                          </a:ln>
+                        </wps:spPr>
+                        <wps:style>
+                          <a:lnRef idx="1">
+                            <a:schemeClr val="accent1"/>
+                          </a:lnRef>
+                          <a:fillRef idx="0">
+                            <a:schemeClr val="accent1"/>
+                          </a:fillRef>
+                          <a:effectRef idx="0">
+                            <a:schemeClr val="accent1"/>
+                          </a:effectRef>
+                          <a:fontRef idx="minor">
+                            <a:schemeClr val="tx1"/>
+                          </a:fontRef>
+                        </wps:style>
+                        <wps:bodyPr/>
+                      </wps:wsp>
+                      <wps:wsp>
+                        <wps:cNvPr id="59459744" name="Zone de texte 2"/>
+                        <wps:cNvSpPr txBox="1">
+                          <a:spLocks noChangeArrowheads="1"/>
+                        </wps:cNvSpPr>
+                        <wps:spPr bwMode="auto">
+                          <a:xfrm>
+                            <a:off x="0" y="323851"/>
+                            <a:ext cx="2186940" cy="1123949"/>
+                          </a:xfrm>
+                          <a:prstGeom prst="rect">
+                            <a:avLst/>
+                          </a:prstGeom>
+                          <a:noFill/>
+                          <a:ln w="9525">
+                            <a:noFill/>
+                            <a:miter lim="800000"/>
+                            <a:headEnd/>
+                            <a:tailEnd/>
+                          </a:ln>
+                        </wps:spPr>
+                        <wps:txbx>
+                          <w:txbxContent>
+                            <w:p>
+                              <w:pPr>
+                                <w:tabs>
+                                  <w:tab w:val="left" w:pos="300"/>
+                                </w:tabs>
+                                <w:spacing w:before="114" w:line="276" w:lineRule="auto"/>
+                                <w:ind w:right="191"/>
+                                <w:rPr>
+                                  <w:color w:val="A6A6A6" w:themeColor="background1" w:themeShade="A6"/>
+                                  <w:sz w:val="20"/>
+                                  <w:szCs w:val="28"/>
+                                  <w:lang w:val="fr-FR"/>
+                                </w:rPr>
+                              </w:pPr>
+                              <w:r>
+                                <w:rPr>
+                                  <w:color w:val="A6A6A6" w:themeColor="background1" w:themeShade="A6"/>
+                                  <w:sz w:val="20"/>
+                                  <w:szCs w:val="28"/>
+                                  <w:lang w:val="fr-FR"/>
+                                </w:rPr>
+                                <w:t>Football</w:t>
+                              </w:r>
+                            </w:p>
+                            <w:p>
+                              <w:pPr>
+                                <w:tabs>
+                                  <w:tab w:val="left" w:pos="300"/>
+                                </w:tabs>
+                                <w:spacing w:before="114" w:line="276" w:lineRule="auto"/>
+                                <w:ind w:right="191"/>
+                                <w:rPr>
+                                  <w:color w:val="A6A6A6" w:themeColor="background1" w:themeShade="A6"/>
+                                  <w:sz w:val="20"/>
+                                  <w:szCs w:val="28"/>
+                                  <w:lang w:val="fr-FR"/>
+                                </w:rPr>
+                              </w:pPr>
+                              <w:r>
+                                <w:rPr>
+                                  <w:color w:val="A6A6A6" w:themeColor="background1" w:themeShade="A6"/>
+                                  <w:sz w:val="20"/>
+                                  <w:szCs w:val="28"/>
+                                  <w:lang w:val="fr-FR"/>
+                                </w:rPr>
+                                <w:t>Musique</w:t>
+                              </w:r>
+                            </w:p>
+                            <w:p>
+                              <w:pPr>
+                                <w:tabs>
+                                  <w:tab w:val="left" w:pos="300"/>
+                                </w:tabs>
+                                <w:spacing w:before="114" w:line="276" w:lineRule="auto"/>
+                                <w:ind w:right="191"/>
+                                <w:rPr>
+                                  <w:color w:val="A6A6A6" w:themeColor="background1" w:themeShade="A6"/>
+                                  <w:sz w:val="20"/>
+                                  <w:szCs w:val="28"/>
+                                  <w:lang w:val="fr-FR"/>
+                                </w:rPr>
+                              </w:pPr>
+                              <w:r>
+                                <w:rPr>
+                                  <w:color w:val="A6A6A6" w:themeColor="background1" w:themeShade="A6"/>
+                                  <w:sz w:val="20"/>
+                                  <w:szCs w:val="28"/>
+                                  <w:lang w:val="fr-FR"/>
+                                </w:rPr>
+                                <w:t>Musculation</w:t>
+                              </w:r>
+                            </w:p>
+                            <w:p>
+                              <w:pPr>
+                                <w:tabs>
+                                  <w:tab w:val="left" w:pos="300"/>
+                                </w:tabs>
+                                <w:spacing w:before="114" w:line="276" w:lineRule="auto"/>
+                                <w:ind w:right="191"/>
+                                <w:rPr>
+                                  <w:color w:val="A6A6A6" w:themeColor="background1" w:themeShade="A6"/>
+                                  <w:sz w:val="20"/>
+                                  <w:szCs w:val="28"/>
+                                  <w:lang w:val="fr-FR"/>
+                                </w:rPr>
+                              </w:pPr>
+                              <w:r>
+                                <w:rPr>
+                                  <w:color w:val="A6A6A6" w:themeColor="background1" w:themeShade="A6"/>
+                                  <w:sz w:val="20"/>
+                                  <w:szCs w:val="28"/>
+                                  <w:lang w:val="fr-FR"/>
+                                </w:rPr>
+                                <w:t>Intelligence</w:t>
+                              </w:r>
+                              <w:r>
+                                <w:rPr>
+                                  <w:color w:val="A6A6A6" w:themeColor="background1" w:themeShade="A6"/>
+                                  <w:sz w:val="20"/>
+                                  <w:szCs w:val="28"/>
+                                  <w:lang w:val="fr-FR"/>
+                                </w:rPr>
+                                <w:t xml:space="preserve"> Artificielle</w:t>
+                              </w:r>
+                            </w:p>
+                            <w:p>
+                              <w:pPr>
+                                <w:tabs>
+                                  <w:tab w:val="left" w:pos="300"/>
+                                </w:tabs>
+                                <w:spacing w:before="114" w:line="276" w:lineRule="auto"/>
+                                <w:ind w:right="191"/>
+                                <w:rPr>
+                                  <w:color w:val="A6A6A6" w:themeColor="background1" w:themeShade="A6"/>
+                                  <w:sz w:val="20"/>
+                                  <w:szCs w:val="28"/>
+                                  <w:lang w:val="fr-FR"/>
+                                </w:rPr>
+                              </w:pPr>
+                            </w:p>
+                          </w:txbxContent>
+                        </wps:txbx>
+                        <wps:bodyPr rot="0" vert="horz" wrap="square" lIns="91440" tIns="45720" rIns="91440" bIns="45720" anchor="t" anchorCtr="0">
+                          <a:noAutofit/>
+                        </wps:bodyPr>
+                      </wps:wsp>
+                    </wpg:wgp>
+                  </a:graphicData>
+                </a:graphic>
+                <wp14:sizeRelV relativeFrom="margin">
+                  <wp14:pctHeight>0</wp14:pctHeight>
+                </wp14:sizeRelV>
+              </wp:anchor>
+            </w:drawing>
+          </mc:Choice>
+          <mc:Fallback>
+            <w:pict>
+              <v:group w14:anchorId="1918F670" id="Groupe 3" o:spid="_x0000_s1039" style="position:absolute;margin-left:-11.25pt;margin-top:426.85pt;width:172.2pt;height:114pt;z-index:251689984;mso-height-relative:margin" coordsize="21869,14478" o:gfxdata="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">
+                <v:shape id="_x0000_s1040" type="#_x0000_t202" style="position:absolute;left:95;width:17056;height:3098;visibility:visible;mso-wrap-style:square;v-text-anchor:top" o:gfxdata="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" filled="f" stroked="f">
+                  <v:textbox>
+                    <w:txbxContent>
+                      <w:p>
+                        <w:pPr>
+                          <w:pStyle w:val="Corpsdetexte"/>
+                          <w:spacing w:before="101"/>
+                          <w:ind w:right="98"/>
+                          <w:rPr>
+                            <w:rFonts w:ascii="Trebuchet MS"/>
+                            <w:color w:val="262626" w:themeColor="text1" w:themeTint="D9"/>
+                            <w:w w:val="95"/>
+                            <w:sz w:val="20"/>
+                            <w:szCs w:val="20"/>
+                            <w:lang w:val="es-ES"/>
+                          </w:rPr>
+                        </w:pPr>
+                        <w:r>
+                          <w:rPr>
+                            <w:rFonts w:ascii="Trebuchet MS"/>
+                            <w:color w:val="262626" w:themeColor="text1" w:themeTint="D9"/>
+                            <w:w w:val="95"/>
+                            <w:sz w:val="20"/>
+                            <w:szCs w:val="20"/>
+                            <w:lang w:val="es-ES"/>
+                          </w:rPr>
+                          <w:t>CENTRES D</w:t>
+                        </w:r>
+                        <w:r>
+                          <w:rPr>
+                            <w:rFonts w:ascii="Trebuchet MS"/>
+                            <w:color w:val="262626" w:themeColor="text1" w:themeTint="D9"/>
+                            <w:w w:val="95"/>
+                            <w:sz w:val="20"/>
+                            <w:szCs w:val="20"/>
+                            <w:lang w:val="es-ES"/>
+                          </w:rPr>
+                          <w:t>’</w:t>
+                        </w:r>
+                        <w:r>
+                          <w:rPr>
+                            <w:rFonts w:ascii="Trebuchet MS"/>
+                            <w:color w:val="262626" w:themeColor="text1" w:themeTint="D9"/>
+                            <w:w w:val="95"/>
+                            <w:sz w:val="20"/>
+                            <w:szCs w:val="20"/>
+                            <w:lang w:val="es-ES"/>
+                          </w:rPr>
+                          <w:t>INT</w:t>
+                        </w:r>
+                        <w:r>
+                          <w:rPr>
+                            <w:rFonts w:ascii="Trebuchet MS"/>
+                            <w:color w:val="262626" w:themeColor="text1" w:themeTint="D9"/>
+                            <w:w w:val="95"/>
+                            <w:sz w:val="20"/>
+                            <w:szCs w:val="20"/>
+                            <w:lang w:val="es-ES"/>
+                          </w:rPr>
+                          <w:t>É</w:t>
+                        </w:r>
+                        <w:r>
+                          <w:rPr>
+                            <w:rFonts w:ascii="Trebuchet MS"/>
+                            <w:color w:val="262626" w:themeColor="text1" w:themeTint="D9"/>
+                            <w:w w:val="95"/>
+                            <w:sz w:val="20"/>
+                            <w:szCs w:val="20"/>
+                            <w:lang w:val="es-ES"/>
+                          </w:rPr>
+                          <w:t>R</w:t>
+                        </w:r>
+                        <w:r>
+                          <w:rPr>
+                            <w:rFonts w:ascii="Trebuchet MS"/>
+                            <w:color w:val="262626" w:themeColor="text1" w:themeTint="D9"/>
+                            <w:w w:val="95"/>
+                            <w:sz w:val="20"/>
+                            <w:szCs w:val="20"/>
+                            <w:lang w:val="es-ES"/>
+                          </w:rPr>
+                          <w:t>Ê</w:t>
+                        </w:r>
+                        <w:r>
+                          <w:rPr>
+                            <w:rFonts w:ascii="Trebuchet MS"/>
+                            <w:color w:val="262626" w:themeColor="text1" w:themeTint="D9"/>
+                            <w:w w:val="95"/>
+                            <w:sz w:val="20"/>
+                            <w:szCs w:val="20"/>
+                            <w:lang w:val="es-ES"/>
+                          </w:rPr>
+                          <w:t>T</w:t>
+                        </w:r>
+                      </w:p>
+                    </w:txbxContent>
+                  </v:textbox>
+                </v:shape>
+                <v:line id="Connecteur droit 3" o:spid="_x0000_s1041" style="position:absolute;visibility:visible;mso-wrap-style:square" from="952,3143" to="21717,3143" o:connectortype="straight" o:gfxdata="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" strokecolor="#bfbfbf [2412]" strokeweight=".5pt">
+                  <v:stroke joinstyle="miter"/>
+                </v:line>
+                <v:line id="Connecteur droit 3" o:spid="_x0000_s1042" style="position:absolute;visibility:visible;mso-wrap-style:square" from="1047,476" to="21774,476" o:connectortype="straight" o:gfxdata="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" strokecolor="#bfbfbf [2412]" strokeweight=".5pt">
+                  <v:stroke joinstyle="miter"/>
+                </v:line>
+                <v:shape id="_x0000_s1043" type="#_x0000_t202" style="position:absolute;top:3238;width:21869;height:11240;visibility:visible;mso-wrap-style:square;v-text-anchor:top" o:gfxdata="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" filled="f" stroked="f">
+                  <v:textbox>
+                    <w:txbxContent>
+                      <w:p>
+                        <w:pPr>
+                          <w:tabs>
+                            <w:tab w:val="left" w:pos="300"/>
+                          </w:tabs>
+                          <w:spacing w:before="114" w:line="276" w:lineRule="auto"/>
+                          <w:ind w:right="191"/>
+                          <w:rPr>
+                            <w:color w:val="A6A6A6" w:themeColor="background1" w:themeShade="A6"/>
+                            <w:sz w:val="20"/>
+                            <w:szCs w:val="28"/>
+                            <w:lang w:val="fr-FR"/>
+                          </w:rPr>
+                        </w:pPr>
+                        <w:r>
+                          <w:rPr>
+                            <w:color w:val="A6A6A6" w:themeColor="background1" w:themeShade="A6"/>
+                            <w:sz w:val="20"/>
+                            <w:szCs w:val="28"/>
+                            <w:lang w:val="fr-FR"/>
+                          </w:rPr>
+                          <w:t>Football</w:t>
+                        </w:r>
+                      </w:p>
+                      <w:p>
+                        <w:pPr>
+                          <w:tabs>
+                            <w:tab w:val="left" w:pos="300"/>
+                          </w:tabs>
+                          <w:spacing w:before="114" w:line="276" w:lineRule="auto"/>
+                          <w:ind w:right="191"/>
+                          <w:rPr>
+                            <w:color w:val="A6A6A6" w:themeColor="background1" w:themeShade="A6"/>
+                            <w:sz w:val="20"/>
+                            <w:szCs w:val="28"/>
+                            <w:lang w:val="fr-FR"/>
+                          </w:rPr>
+                        </w:pPr>
+                        <w:r>
+                          <w:rPr>
+                            <w:color w:val="A6A6A6" w:themeColor="background1" w:themeShade="A6"/>
+                            <w:sz w:val="20"/>
+                            <w:szCs w:val="28"/>
+                            <w:lang w:val="fr-FR"/>
+                          </w:rPr>
+                          <w:t>Musique</w:t>
+                        </w:r>
+                      </w:p>
+                      <w:p>
+                        <w:pPr>
+                          <w:tabs>
+                            <w:tab w:val="left" w:pos="300"/>
+                          </w:tabs>
+                          <w:spacing w:before="114" w:line="276" w:lineRule="auto"/>
+                          <w:ind w:right="191"/>
+                          <w:rPr>
+                            <w:color w:val="A6A6A6" w:themeColor="background1" w:themeShade="A6"/>
+                            <w:sz w:val="20"/>
+                            <w:szCs w:val="28"/>
+                            <w:lang w:val="fr-FR"/>
+                          </w:rPr>
+                        </w:pPr>
+                        <w:r>
+                          <w:rPr>
+                            <w:color w:val="A6A6A6" w:themeColor="background1" w:themeShade="A6"/>
+                            <w:sz w:val="20"/>
+                            <w:szCs w:val="28"/>
+                            <w:lang w:val="fr-FR"/>
+                          </w:rPr>
+                          <w:t>Musculation</w:t>
+                        </w:r>
+                      </w:p>
+                      <w:p>
+                        <w:pPr>
+                          <w:tabs>
+                            <w:tab w:val="left" w:pos="300"/>
+                          </w:tabs>
+                          <w:spacing w:before="114" w:line="276" w:lineRule="auto"/>
+                          <w:ind w:right="191"/>
+                          <w:rPr>
+                            <w:color w:val="A6A6A6" w:themeColor="background1" w:themeShade="A6"/>
+                            <w:sz w:val="20"/>
+                            <w:szCs w:val="28"/>
+                            <w:lang w:val="fr-FR"/>
+                          </w:rPr>
+                        </w:pPr>
+                        <w:r>
+                          <w:rPr>
+                            <w:color w:val="A6A6A6" w:themeColor="background1" w:themeShade="A6"/>
+                            <w:sz w:val="20"/>
+                            <w:szCs w:val="28"/>
+                            <w:lang w:val="fr-FR"/>
+                          </w:rPr>
+                          <w:t>Intelligence</w:t>
+                        </w:r>
+                        <w:r>
+                          <w:rPr>
+                            <w:color w:val="A6A6A6" w:themeColor="background1" w:themeShade="A6"/>
+                            <w:sz w:val="20"/>
+                            <w:szCs w:val="28"/>
+                            <w:lang w:val="fr-FR"/>
+                          </w:rPr>
+                          <w:t xml:space="preserve"> Artificielle</w:t>
+                        </w:r>
+                      </w:p>
+                      <w:p>
+                        <w:pPr>
+                          <w:tabs>
+                            <w:tab w:val="left" w:pos="300"/>
+                          </w:tabs>
+                          <w:spacing w:before="114" w:line="276" w:lineRule="auto"/>
+                          <w:ind w:right="191"/>
+                          <w:rPr>
+                            <w:color w:val="A6A6A6" w:themeColor="background1" w:themeShade="A6"/>
+                            <w:sz w:val="20"/>
+                            <w:szCs w:val="28"/>
+                            <w:lang w:val="fr-FR"/>
+                          </w:rPr>
+                        </w:pPr>
+                      </w:p>
+                    </w:txbxContent>
+                  </v:textbox>
+                </v:shape>
+              </v:group>
+            </w:pict>
+          </mc:Fallback>
+        </mc:AlternateContent>
+      </w:r>
+      <w:r>
+        <w:rPr>
+          <w:noProof/>
+          <w:sz w:val="20"/>
+          <w14:ligatures w14:val="standardContextual"/>
+        </w:rPr>
+        <mc:AlternateContent>
+          <mc:Choice Requires="wpg">
+            <w:drawing>
+              <wp:anchor distT="0" distB="0" distL="114300" distR="114300" simplePos="0" relativeHeight="251681792" behindDoc="0" locked="0" layoutInCell="1" allowOverlap="1" wp14:anchorId="74FE1078" wp14:editId="791D3D63">
+                <wp:simplePos x="0" y="0"/>
+                <wp:positionH relativeFrom="column">
+                  <wp:posOffset>2228850</wp:posOffset>
+                </wp:positionH>
+                <wp:positionV relativeFrom="paragraph">
+                  <wp:posOffset>3973195</wp:posOffset>
+                </wp:positionV>
+                <wp:extent cx="4389120" cy="1244148"/>
+                <wp:effectExtent l="0" t="0" r="0" b="0"/>
+                <wp:wrapNone/>
+                <wp:docPr id="258582367" name="Groupe 3"/>
+                <wp:cNvGraphicFramePr/>
+                <a:graphic xmlns:a="http://schemas.openxmlformats.org/drawingml/2006/main">
+                  <a:graphicData uri="http://schemas.microsoft.com/office/word/2010/wordprocessingGroup">
+                    <wpg:wgp>
+                      <wpg:cNvGrpSpPr/>
+                      <wpg:grpSpPr>
+                        <a:xfrm>
+                          <a:off x="0" y="0"/>
+                          <a:ext cx="4389120" cy="1244148"/>
+                          <a:chOff x="0" y="47501"/>
+                          <a:chExt cx="4389433" cy="1381277"/>
+                        </a:xfrm>
+                      </wpg:grpSpPr>
+                      <wps:wsp>
+                        <wps:cNvPr id="636787075" name="Zone de texte 2"/>
+                        <wps:cNvSpPr txBox="1">
+                          <a:spLocks noChangeArrowheads="1"/>
+                        </wps:cNvSpPr>
+                        <wps:spPr bwMode="auto">
+                          <a:xfrm>
+                            <a:off x="11875" y="49300"/>
+                            <a:ext cx="2305050" cy="309880"/>
+                          </a:xfrm>
+                          <a:prstGeom prst="rect">
+                            <a:avLst/>
+                          </a:prstGeom>
+                          <a:noFill/>
+                          <a:ln w="9525">
+                            <a:noFill/>
+                            <a:miter lim="800000"/>
+                            <a:headEnd/>
+                            <a:tailEnd/>
+                          </a:ln>
+                        </wps:spPr>
+                        <wps:txbx>
+                          <w:txbxContent>
+                            <w:p>
+                              <w:pPr>
+                                <w:pStyle w:val="Corpsdetexte"/>
+                                <w:rPr>
+                                  <w:lang w:val="es-ES"/>
+                                </w:rPr>
+                              </w:pPr>
+                              <w:r>
+                                <w:rPr>
+                                  <w:w w:val="95"/>
+                                  <w:sz w:val="20"/>
+                                  <w:szCs w:val="20"/>
+                                  <w:lang w:val="es-ES"/>
+                                </w:rPr>
+                                <w:t>FORMATION</w:t>
+                              </w:r>
+                            </w:p>
+                          </w:txbxContent>
+                        </wps:txbx>
+                        <wps:bodyPr rot="0" vert="horz" wrap="square" lIns="91440" tIns="45720" rIns="91440" bIns="45720" anchor="t" anchorCtr="0">
+                          <a:noAutofit/>
+                        </wps:bodyPr>
+                      </wps:wsp>
+                      <wps:wsp>
+                        <wps:cNvPr id="1051546901" name="Connecteur droit 3"/>
+                        <wps:cNvCnPr/>
+                        <wps:spPr>
+                          <a:xfrm>
+                            <a:off x="106878" y="320634"/>
+                            <a:ext cx="4182110" cy="0"/>
+                          </a:xfrm>
+                          <a:prstGeom prst="line">
+                            <a:avLst/>
+                          </a:prstGeom>
+                          <a:ln>
+                            <a:solidFill>
+                              <a:schemeClr val="bg1">
+                                <a:lumMod val="75000"/>
+                              </a:schemeClr>
+                            </a:solidFill>
+                          </a:ln>
+                        </wps:spPr>
+                        <wps:style>
+                          <a:lnRef idx="1">
+                            <a:schemeClr val="accent1"/>
+                          </a:lnRef>
+                          <a:fillRef idx="0">
+                            <a:schemeClr val="accent1"/>
+                          </a:fillRef>
+                          <a:effectRef idx="0">
+                            <a:schemeClr val="accent1"/>
+                          </a:effectRef>
+                          <a:fontRef idx="minor">
+                            <a:schemeClr val="tx1"/>
+                          </a:fontRef>
+                        </wps:style>
+                        <wps:bodyPr/>
+                      </wps:wsp>
+                      <wps:wsp>
+                        <wps:cNvPr id="577383387" name="Connecteur droit 3"/>
+                        <wps:cNvCnPr/>
+                        <wps:spPr>
+                          <a:xfrm>
+                            <a:off x="106878" y="47501"/>
+                            <a:ext cx="4182110" cy="0"/>
+                          </a:xfrm>
+                          <a:prstGeom prst="line">
+                            <a:avLst/>
+                          </a:prstGeom>
+                          <a:ln>
+                            <a:solidFill>
+                              <a:schemeClr val="bg1">
+                                <a:lumMod val="75000"/>
+                              </a:schemeClr>
+                            </a:solidFill>
+                          </a:ln>
+                        </wps:spPr>
+                        <wps:style>
+                          <a:lnRef idx="1">
+                            <a:schemeClr val="accent1"/>
+                          </a:lnRef>
+                          <a:fillRef idx="0">
+                            <a:schemeClr val="accent1"/>
+                          </a:fillRef>
+                          <a:effectRef idx="0">
+                            <a:schemeClr val="accent1"/>
+                          </a:effectRef>
+                          <a:fontRef idx="minor">
+                            <a:schemeClr val="tx1"/>
+                          </a:fontRef>
+                        </wps:style>
+                        <wps:bodyPr/>
+                      </wps:wsp>
+                      <wps:wsp>
+                        <wps:cNvPr id="392886903" name="Zone de texte 2"/>
+                        <wps:cNvSpPr txBox="1">
+                          <a:spLocks noChangeArrowheads="1"/>
+                        </wps:cNvSpPr>
+                        <wps:spPr bwMode="auto">
+                          <a:xfrm>
+                            <a:off x="11875" y="312746"/>
+                            <a:ext cx="4019550" cy="313690"/>
+                          </a:xfrm>
+                          <a:prstGeom prst="rect">
+                            <a:avLst/>
+                          </a:prstGeom>
+                          <a:noFill/>
+                          <a:ln w="9525">
+                            <a:noFill/>
+                            <a:miter lim="800000"/>
+                            <a:headEnd/>
+                            <a:tailEnd/>
+                          </a:ln>
+                        </wps:spPr>
+                        <wps:txbx>
+                          <w:txbxContent>
+                            <w:p>
+                              <w:pPr>
+                                <w:pStyle w:val="Corpsdetexte"/>
+                                <w:spacing w:before="101"/>
+                                <w:ind w:right="98"/>
+                                <w:rPr>
+                                  <w:color w:val="262626" w:themeColor="text1" w:themeTint="D9"/>
+                                  <w:sz w:val="20"/>
+                                  <w:szCs w:val="20"/>
+                                  <w:lang w:val="es-ES"/>
+                                </w:rPr>
+                              </w:pPr>
+                              <w:proofErr w:type="spellStart"/>
+                              <w:r>
+                                <w:rPr>
+                                  <w:b/>
+                                  <w:color w:val="2F2F2F"/>
+                                  <w:position w:val="4"/>
+                                  <w:sz w:val="20"/>
+                                  <w:szCs w:val="20"/>
+                                  <w:lang w:val="es-ES"/>
+                                </w:rPr>
+                                <w:t>Licence</w:t>
+                              </w:r>
+                              <w:proofErr w:type="spellEnd"/>
+                              <w:r>
+                                <w:rPr>
+                                  <w:b/>
+                                  <w:color w:val="2F2F2F"/>
+                                  <w:position w:val="4"/>
+                                  <w:sz w:val="20"/>
+                                  <w:szCs w:val="20"/>
+                                  <w:lang w:val="es-ES"/>
+                                </w:rPr>
+                                <w:t xml:space="preserve"> 2 | </w:t>
+                              </w:r>
+                              <w:proofErr w:type="spellStart"/>
+                              <w:r>
+                                <w:rPr>
+                                  <w:b/>
+                                  <w:color w:val="2F2F2F"/>
+                                  <w:position w:val="4"/>
+                                  <w:sz w:val="20"/>
+                                  <w:szCs w:val="20"/>
+                                  <w:lang w:val="es-ES"/>
+                                </w:rPr>
+                                <w:t>Economie</w:t>
+                              </w:r>
+                              <w:proofErr w:type="spellEnd"/>
+                              <w:r>
+                                <w:rPr>
+                                  <w:b/>
+                                  <w:color w:val="2F2F2F"/>
+                                  <w:position w:val="4"/>
+                                  <w:sz w:val="20"/>
+                                  <w:szCs w:val="20"/>
+                                  <w:lang w:val="es-ES"/>
+                                </w:rPr>
+                                <w:t xml:space="preserve"> Et D</w:t>
+                              </w:r>
+                              <w:r>
+                                <w:rPr>
+                                  <w:b/>
+                                  <w:color w:val="2F2F2F"/>
+                                  <w:position w:val="4"/>
+                                  <w:sz w:val="20"/>
+                                  <w:szCs w:val="20"/>
+                                  <w:lang w:val="es-ES"/>
+                                </w:rPr>
+                                <w:t>é</w:t>
+                              </w:r>
+                              <w:r>
+                                <w:rPr>
+                                  <w:b/>
+                                  <w:color w:val="2F2F2F"/>
+                                  <w:position w:val="4"/>
+                                  <w:sz w:val="20"/>
+                                  <w:szCs w:val="20"/>
+                                  <w:lang w:val="es-ES"/>
+                                </w:rPr>
+                                <w:t>veloppement</w:t>
+                              </w:r>
+                            </w:p>
+                          </w:txbxContent>
+                        </wps:txbx>
+                        <wps:bodyPr rot="0" vert="horz" wrap="square" lIns="91440" tIns="45720" rIns="91440" bIns="45720" anchor="t" anchorCtr="0">
+                          <a:noAutofit/>
+                        </wps:bodyPr>
+                      </wps:wsp>
+                      <wps:wsp>
+                        <wps:cNvPr id="1310104125" name="Zone de texte 2"/>
+                        <wps:cNvSpPr txBox="1">
+                          <a:spLocks noChangeArrowheads="1"/>
+                        </wps:cNvSpPr>
+                        <wps:spPr bwMode="auto">
+                          <a:xfrm>
+                            <a:off x="0" y="568277"/>
+                            <a:ext cx="1992630" cy="291548"/>
+                          </a:xfrm>
+                          <a:prstGeom prst="rect">
+                            <a:avLst/>
+                          </a:prstGeom>
+                          <a:noFill/>
+                          <a:ln w="9525">
+                            <a:noFill/>
+                            <a:miter lim="800000"/>
+                            <a:headEnd/>
+                            <a:tailEnd/>
+                          </a:ln>
+                        </wps:spPr>
+                        <wps:txbx>
+                          <w:txbxContent>
+                            <w:p>
+                              <w:pPr>
+                                <w:rPr>
+                                  <w:color w:val="2F2F2F"/>
+                                  <w:sz w:val="20"/>
+                                  <w:szCs w:val="20"/>
+                                </w:rPr>
+                              </w:pPr>
+                              <w:proofErr w:type="spellStart"/>
+                              <w:r>
+                                <w:rPr>
+                                  <w:color w:val="2F2F2F"/>
+                                  <w:sz w:val="20"/>
+                                  <w:szCs w:val="20"/>
+                                  <w:lang w:val="es-ES"/>
+                                </w:rPr>
+                                <w:t>Université</w:t>
+                              </w:r>
+                              <w:proofErr w:type="spellEnd"/>
+                              <w:r>
+                                <w:rPr>
+                                  <w:color w:val="2F2F2F"/>
+                                  <w:sz w:val="20"/>
+                                  <w:szCs w:val="20"/>
+                                  <w:lang w:val="es-ES"/>
+                                </w:rPr>
+                                <w:t xml:space="preserve"> </w:t>
+                              </w:r>
+                              <w:proofErr w:type="spellStart"/>
+                              <w:r>
+                                <w:rPr>
+                                  <w:color w:val="2F2F2F"/>
+                                  <w:sz w:val="20"/>
+                                  <w:szCs w:val="20"/>
+                                  <w:lang w:val="es-ES"/>
+                                </w:rPr>
+                                <w:t>Catholique</w:t>
+                              </w:r>
+                              <w:proofErr w:type="spellEnd"/>
+                              <w:r>
+                                <w:rPr>
+                                  <w:color w:val="2F2F2F"/>
+                                  <w:sz w:val="20"/>
+                                  <w:szCs w:val="20"/>
+                                  <w:lang w:val="es-ES"/>
+                                </w:rPr>
+                                <w:t xml:space="preserve"> du Congo</w:t>
+                              </w:r>
+                            </w:p>
+                          </w:txbxContent>
+                        </wps:txbx>
+                        <wps:bodyPr rot="0" vert="horz" wrap="square" lIns="91440" tIns="45720" rIns="91440" bIns="45720" anchor="t" anchorCtr="0">
+                          <a:noAutofit/>
+                        </wps:bodyPr>
+                      </wps:wsp>
+                      <wps:wsp>
+                        <wps:cNvPr id="2036783882" name="Zone de texte 2"/>
+                        <wps:cNvSpPr txBox="1">
+                          <a:spLocks noChangeArrowheads="1"/>
+                        </wps:cNvSpPr>
+                        <wps:spPr bwMode="auto">
+                          <a:xfrm>
+                            <a:off x="2683823" y="383998"/>
+                            <a:ext cx="1705610" cy="260986"/>
+                          </a:xfrm>
+                          <a:prstGeom prst="rect">
+                            <a:avLst/>
+                          </a:prstGeom>
+                          <a:noFill/>
+                          <a:ln w="9525">
+                            <a:noFill/>
+                            <a:miter lim="800000"/>
+                            <a:headEnd/>
+                            <a:tailEnd/>
+                          </a:ln>
+                        </wps:spPr>
+                        <wps:txbx>
+                          <w:txbxContent>
+                            <w:p>
+                              <w:pPr>
+                                <w:jc w:val="right"/>
+                                <w:rPr>
+                                  <w:color w:val="2F2F2F"/>
+                                  <w:sz w:val="20"/>
+                                  <w:szCs w:val="20"/>
+                                  <w:lang w:val="fr-FR"/>
+                                </w:rPr>
+                              </w:pPr>
+                              <w:r>
+                                <w:rPr>
+                                  <w:color w:val="2F2F2F"/>
+                                  <w:position w:val="-4"/>
+                                  <w:sz w:val="20"/>
+                                  <w:szCs w:val="20"/>
+                                  <w:lang w:val="fr-FR"/>
+                                </w:rPr>
+                                <w:t>2026 En cours</w:t>
+                              </w:r>
+                            </w:p>
+                          </w:txbxContent>
+                        </wps:txbx>
+                        <wps:bodyPr rot="0" vert="horz" wrap="square" lIns="91440" tIns="45720" rIns="91440" bIns="45720" anchor="t" anchorCtr="0">
+                          <a:noAutofit/>
+                        </wps:bodyPr>
+                      </wps:wsp>
+                      <wps:wsp>
+                        <wps:cNvPr id="1673552926" name="Zone de texte 2"/>
+                        <wps:cNvSpPr txBox="1">
+                          <a:spLocks noChangeArrowheads="1"/>
+                        </wps:cNvSpPr>
+                        <wps:spPr bwMode="auto">
+                          <a:xfrm>
+                            <a:off x="11875" y="788609"/>
+                            <a:ext cx="4019550" cy="332073"/>
+                          </a:xfrm>
+                          <a:prstGeom prst="rect">
+                            <a:avLst/>
+                          </a:prstGeom>
+                          <a:noFill/>
+                          <a:ln w="9525">
+                            <a:noFill/>
+                            <a:miter lim="800000"/>
+                            <a:headEnd/>
+                            <a:tailEnd/>
+                          </a:ln>
+                        </wps:spPr>
+                        <wps:txbx>
+                          <w:txbxContent>
+                            <w:p>
+                              <w:pPr>
+                                <w:pStyle w:val="Corpsdetexte"/>
+                                <w:spacing w:before="101"/>
+                                <w:ind w:right="98"/>
+                                <w:rPr>
+                                  <w:color w:val="262626" w:themeColor="text1" w:themeTint="D9"/>
+                                  <w:sz w:val="20"/>
+                                  <w:szCs w:val="20"/>
+                                  <w:lang w:val="es-ES"/>
+                                </w:rPr>
+                              </w:pPr>
+                              <w:proofErr w:type="spellStart"/>
+                              <w:r>
+                                <w:rPr>
+                                  <w:b/>
+                                  <w:color w:val="2F2F2F"/>
+                                  <w:position w:val="4"/>
+                                  <w:sz w:val="20"/>
+                                  <w:szCs w:val="20"/>
+                                  <w:lang w:val="es-ES"/>
+                                </w:rPr>
+                                <w:t>Diplôme</w:t>
+                              </w:r>
+                              <w:proofErr w:type="spellEnd"/>
+                              <w:r>
+                                <w:rPr>
+                                  <w:b/>
+                                  <w:color w:val="2F2F2F"/>
+                                  <w:position w:val="4"/>
+                                  <w:sz w:val="20"/>
+                                  <w:szCs w:val="20"/>
+                                  <w:lang w:val="es-ES"/>
+                                </w:rPr>
+                                <w:t xml:space="preserve"> </w:t>
+                              </w:r>
+                              <w:proofErr w:type="spellStart"/>
+                              <w:r>
+                                <w:rPr>
+                                  <w:b/>
+                                  <w:color w:val="2F2F2F"/>
+                                  <w:position w:val="4"/>
+                                  <w:sz w:val="20"/>
+                                  <w:szCs w:val="20"/>
+                                  <w:lang w:val="es-ES"/>
+                                </w:rPr>
+                                <w:t>d’Etat</w:t>
+                              </w:r>
+                              <w:proofErr w:type="spellEnd"/>
+                              <w:r>
+                                <w:rPr>
+                                  <w:b/>
+                                  <w:color w:val="2F2F2F"/>
+                                  <w:position w:val="4"/>
+                                  <w:sz w:val="20"/>
+                                  <w:szCs w:val="20"/>
+                                  <w:lang w:val="es-ES"/>
+                                </w:rPr>
+                                <w:t xml:space="preserve"> | </w:t>
+                              </w:r>
+                              <w:proofErr w:type="spellStart"/>
+                              <w:r>
+                                <w:rPr>
+                                  <w:b/>
+                                  <w:color w:val="2F2F2F"/>
+                                  <w:position w:val="4"/>
+                                  <w:sz w:val="20"/>
+                                  <w:szCs w:val="20"/>
+                                  <w:lang w:val="es-ES"/>
+                                </w:rPr>
+                                <w:t>Commerciale</w:t>
+                              </w:r>
+                              <w:proofErr w:type="spellEnd"/>
+                              <w:r>
+                                <w:rPr>
+                                  <w:b/>
+                                  <w:color w:val="2F2F2F"/>
+                                  <w:position w:val="4"/>
+                                  <w:sz w:val="20"/>
+                                  <w:szCs w:val="20"/>
+                                  <w:lang w:val="es-ES"/>
+                                </w:rPr>
+                                <w:t xml:space="preserve"> et </w:t>
+                              </w:r>
+                              <w:proofErr w:type="spellStart"/>
+                              <w:r>
+                                <w:rPr>
+                                  <w:b/>
+                                  <w:color w:val="2F2F2F"/>
+                                  <w:position w:val="4"/>
+                                  <w:sz w:val="20"/>
+                                  <w:szCs w:val="20"/>
+                                  <w:lang w:val="es-ES"/>
+                                </w:rPr>
+                                <w:t>Gestion</w:t>
+                              </w:r>
+                              <w:proofErr w:type="spellEnd"/>
+                            </w:p>
+                          </w:txbxContent>
+                        </wps:txbx>
+                        <wps:bodyPr rot="0" vert="horz" wrap="square" lIns="91440" tIns="45720" rIns="91440" bIns="45720" anchor="t" anchorCtr="0">
+                          <a:noAutofit/>
+                        </wps:bodyPr>
+                      </wps:wsp>
+                      <wps:wsp>
+                        <wps:cNvPr id="996651291" name="Zone de texte 2"/>
+                        <wps:cNvSpPr txBox="1">
+                          <a:spLocks noChangeArrowheads="1"/>
+                        </wps:cNvSpPr>
+                        <wps:spPr bwMode="auto">
+                          <a:xfrm>
+                            <a:off x="0" y="1082413"/>
+                            <a:ext cx="1705610" cy="346365"/>
+                          </a:xfrm>
+                          <a:prstGeom prst="rect">
+                            <a:avLst/>
+                          </a:prstGeom>
+                          <a:noFill/>
+                          <a:ln w="9525">
+                            <a:noFill/>
+                            <a:miter lim="800000"/>
+                            <a:headEnd/>
+                            <a:tailEnd/>
+                          </a:ln>
+                        </wps:spPr>
+                        <wps:txbx>
+                          <w:txbxContent>
+                            <w:p>
+                              <w:pPr>
+                                <w:rPr>
+                                  <w:color w:val="2F2F2F"/>
+                                  <w:sz w:val="20"/>
+                                  <w:szCs w:val="20"/>
+                                  <w:lang w:val="es-ES"/>
+                                </w:rPr>
+                              </w:pPr>
+                              <w:proofErr w:type="spellStart"/>
+                              <w:r>
+                                <w:rPr>
+                                  <w:color w:val="2F2F2F"/>
+                                  <w:sz w:val="20"/>
+                                  <w:szCs w:val="20"/>
+                                  <w:lang w:val="es-ES"/>
+                                </w:rPr>
+                                <w:t>Révérend</w:t>
+                              </w:r>
+                              <w:proofErr w:type="spellEnd"/>
+                              <w:r>
+                                <w:rPr>
+                                  <w:color w:val="2F2F2F"/>
+                                  <w:sz w:val="20"/>
+                                  <w:szCs w:val="20"/>
+                                  <w:lang w:val="es-ES"/>
+                                </w:rPr>
+                                <w:t xml:space="preserve"> Kim</w:t>
+                              </w:r>
+                            </w:p>
+                          </w:txbxContent>
+                        </wps:txbx>
+                        <wps:bodyPr rot="0" vert="horz" wrap="square" lIns="91440" tIns="45720" rIns="91440" bIns="45720" anchor="t" anchorCtr="0">
+                          <a:noAutofit/>
+                        </wps:bodyPr>
+                      </wps:wsp>
+                      <wps:wsp>
+                        <wps:cNvPr id="1326918901" name="Zone de texte 2"/>
+                        <wps:cNvSpPr txBox="1">
+                          <a:spLocks noChangeArrowheads="1"/>
+                        </wps:cNvSpPr>
+                        <wps:spPr bwMode="auto">
+                          <a:xfrm>
+                            <a:off x="2458192" y="860227"/>
+                            <a:ext cx="1929765" cy="260986"/>
+                          </a:xfrm>
+                          <a:prstGeom prst="rect">
+                            <a:avLst/>
+                          </a:prstGeom>
+                          <a:noFill/>
+                          <a:ln w="9525">
+                            <a:noFill/>
+                            <a:miter lim="800000"/>
+                            <a:headEnd/>
+                            <a:tailEnd/>
+                          </a:ln>
+                        </wps:spPr>
+                        <wps:txbx>
+                          <w:txbxContent>
+                            <w:p>
+                              <w:pPr>
+                                <w:jc w:val="right"/>
+                                <w:rPr>
+                                  <w:color w:val="2F2F2F"/>
+                                  <w:sz w:val="20"/>
+                                  <w:szCs w:val="20"/>
+                                  <w:lang w:val="fr-FR"/>
+                                </w:rPr>
+                              </w:pPr>
+                              <w:proofErr w:type="spellStart"/>
+                              <w:r>
+                                <w:rPr>
+                                  <w:color w:val="2F2F2F"/>
+                                  <w:position w:val="-4"/>
+                                  <w:sz w:val="20"/>
+                                  <w:szCs w:val="20"/>
+                                </w:rPr>
+                                <w:t>Septembre</w:t>
+                              </w:r>
+                              <w:proofErr w:type="spellEnd"/>
+                              <w:r>
+                                <w:rPr>
+                                  <w:color w:val="2F2F2F"/>
+                                  <w:spacing w:val="6"/>
+                                  <w:position w:val="-4"/>
+                                  <w:sz w:val="20"/>
+                                  <w:szCs w:val="20"/>
+                                </w:rPr>
+                                <w:t xml:space="preserve"> </w:t>
+                              </w:r>
+                              <w:r>
+                                <w:rPr>
+                                  <w:color w:val="2F2F2F"/>
+                                  <w:position w:val="-4"/>
+                                  <w:sz w:val="20"/>
+                                  <w:szCs w:val="20"/>
+                                </w:rPr>
+                                <w:t>20</w:t>
+                              </w:r>
+                              <w:r>
+                                <w:rPr>
+                                  <w:color w:val="2F2F2F"/>
+                                  <w:position w:val="-4"/>
+                                  <w:sz w:val="20"/>
+                                  <w:szCs w:val="20"/>
+                                </w:rPr>
+                                <w:t>22</w:t>
+                              </w:r>
+                              <w:r>
+                                <w:rPr>
+                                  <w:color w:val="2F2F2F"/>
+                                  <w:spacing w:val="27"/>
+                                  <w:position w:val="-4"/>
+                                  <w:sz w:val="20"/>
+                                  <w:szCs w:val="20"/>
+                                </w:rPr>
+                                <w:t xml:space="preserve"> </w:t>
+                              </w:r>
+                              <w:r>
+                                <w:rPr>
+                                  <w:color w:val="2F2F2F"/>
+                                  <w:position w:val="-4"/>
+                                  <w:sz w:val="20"/>
+                                  <w:szCs w:val="20"/>
+                                </w:rPr>
+                                <w:t>—</w:t>
+                              </w:r>
+                              <w:r>
+                                <w:rPr>
+                                  <w:color w:val="2F2F2F"/>
+                                  <w:spacing w:val="28"/>
+                                  <w:position w:val="-4"/>
+                                  <w:sz w:val="20"/>
+                                  <w:szCs w:val="20"/>
+                                </w:rPr>
+                                <w:t xml:space="preserve"> </w:t>
+                              </w:r>
+                              <w:r>
+                                <w:rPr>
+                                  <w:color w:val="2F2F2F"/>
+                                  <w:position w:val="-4"/>
+                                  <w:sz w:val="20"/>
+                                  <w:szCs w:val="20"/>
+                                </w:rPr>
+                                <w:t>Juin</w:t>
+                              </w:r>
+                              <w:r>
+                                <w:rPr>
+                                  <w:color w:val="2F2F2F"/>
+                                  <w:spacing w:val="6"/>
+                                  <w:position w:val="-4"/>
+                                  <w:sz w:val="20"/>
+                                  <w:szCs w:val="20"/>
+                                </w:rPr>
+                                <w:t xml:space="preserve"> </w:t>
+                              </w:r>
+                              <w:r>
+                                <w:rPr>
+                                  <w:color w:val="2F2F2F"/>
+                                  <w:position w:val="-4"/>
+                                  <w:sz w:val="20"/>
+                                  <w:szCs w:val="20"/>
+                                </w:rPr>
+                                <w:t>20</w:t>
+                              </w:r>
+                              <w:r>
+                                <w:rPr>
+                                  <w:color w:val="2F2F2F"/>
+                                  <w:position w:val="-4"/>
+                                  <w:sz w:val="20"/>
+                                  <w:szCs w:val="20"/>
+                                </w:rPr>
+                                <w:t>23</w:t>
+                              </w:r>
+                            </w:p>
+                          </w:txbxContent>
+                        </wps:txbx>
+                        <wps:bodyPr rot="0" vert="horz" wrap="square" lIns="91440" tIns="45720" rIns="91440" bIns="45720" anchor="t" anchorCtr="0">
+                          <a:noAutofit/>
+                        </wps:bodyPr>
+                      </wps:wsp>
+                    </wpg:wgp>
+                  </a:graphicData>
+                </a:graphic>
+                <wp14:sizeRelV relativeFrom="margin">
+                  <wp14:pctHeight>0</wp14:pctHeight>
+                </wp14:sizeRelV>
+              </wp:anchor>
+            </w:drawing>
+          </mc:Choice>
+          <mc:Fallback>
+            <w:pict>
+              <v:group w14:anchorId="74FE1078" id="_x0000_s1044" style="position:absolute;margin-left:175.5pt;margin-top:312.85pt;width:345.6pt;height:97.95pt;z-index:251681792;mso-height-relative:margin" coordorigin=",475" coordsize="43894,13812" o:gfxdata="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">
+                <v:shape id="_x0000_s1045" type="#_x0000_t202" style="position:absolute;left:118;top:493;width:23051;height:3098;visibility:visible;mso-wrap-style:square;v-text-anchor:top" o:gfxdata="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" filled="f" stroked="f">
+                  <v:textbox>
+                    <w:txbxContent>
+                      <w:p>
+                        <w:pPr>
+                          <w:pStyle w:val="Corpsdetexte"/>
+                          <w:rPr>
+                            <w:lang w:val="es-ES"/>
+                          </w:rPr>
+                        </w:pPr>
+                        <w:r>
+                          <w:rPr>
+                            <w:w w:val="95"/>
+                            <w:sz w:val="20"/>
+                            <w:szCs w:val="20"/>
+                            <w:lang w:val="es-ES"/>
+                          </w:rPr>
+                          <w:t>FORMATION</w:t>
+                        </w:r>
+                      </w:p>
+                    </w:txbxContent>
+                  </v:textbox>
+                </v:shape>
+                <v:line id="Connecteur droit 3" o:spid="_x0000_s1046" style="position:absolute;visibility:visible;mso-wrap-style:square" from="1068,3206" to="42889,3206" o:connectortype="straight" o:gfxdata="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" strokecolor="#bfbfbf [2412]" strokeweight=".5pt">
+                  <v:stroke joinstyle="miter"/>
+                </v:line>
+                <v:line id="Connecteur droit 3" o:spid="_x0000_s1047" style="position:absolute;visibility:visible;mso-wrap-style:square" from="1068,475" to="42889,475" o:connectortype="straight" o:gfxdata="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" strokecolor="#bfbfbf [2412]" strokeweight=".5pt">
+                  <v:stroke joinstyle="miter"/>
+                </v:line>
+                <v:shape id="_x0000_s1048" type="#_x0000_t202" style="position:absolute;left:118;top:3127;width:40196;height:3137;visibility:visible;mso-wrap-style:square;v-text-anchor:top" o:gfxdata="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" filled="f" stroked="f">
+                  <v:textbox>
+                    <w:txbxContent>
+                      <w:p>
+                        <w:pPr>
+                          <w:pStyle w:val="Corpsdetexte"/>
+                          <w:spacing w:before="101"/>
+                          <w:ind w:right="98"/>
+                          <w:rPr>
+                            <w:color w:val="262626" w:themeColor="text1" w:themeTint="D9"/>
+                            <w:sz w:val="20"/>
+                            <w:szCs w:val="20"/>
+                            <w:lang w:val="es-ES"/>
+                          </w:rPr>
+                        </w:pPr>
+                        <w:proofErr w:type="spellStart"/>
+                        <w:r>
+                          <w:rPr>
+                            <w:b/>
+                            <w:color w:val="2F2F2F"/>
+                            <w:position w:val="4"/>
+                            <w:sz w:val="20"/>
+                            <w:szCs w:val="20"/>
+                            <w:lang w:val="es-ES"/>
+                          </w:rPr>
+                          <w:t>Licence</w:t>
+                        </w:r>
+                        <w:proofErr w:type="spellEnd"/>
+                        <w:r>
+                          <w:rPr>
+                            <w:b/>
+                            <w:color w:val="2F2F2F"/>
+                            <w:position w:val="4"/>
+                            <w:sz w:val="20"/>
+                            <w:szCs w:val="20"/>
+                            <w:lang w:val="es-ES"/>
+                          </w:rPr>
+                          <w:t xml:space="preserve"> 2 | </w:t>
+                        </w:r>
+                        <w:proofErr w:type="spellStart"/>
+                        <w:r>
+                          <w:rPr>
+                            <w:b/>
+                            <w:color w:val="2F2F2F"/>
+                            <w:position w:val="4"/>
+                            <w:sz w:val="20"/>
+                            <w:szCs w:val="20"/>
+                            <w:lang w:val="es-ES"/>
+                          </w:rPr>
+                          <w:t>Economie</w:t>
+                        </w:r>
+                        <w:proofErr w:type="spellEnd"/>
+                        <w:r>
+                          <w:rPr>
+                            <w:b/>
+                            <w:color w:val="2F2F2F"/>
+                            <w:position w:val="4"/>
+                            <w:sz w:val="20"/>
+                            <w:szCs w:val="20"/>
+                            <w:lang w:val="es-ES"/>
+                          </w:rPr>
+                          <w:t xml:space="preserve"> Et D</w:t>
+                        </w:r>
+                        <w:r>
+                          <w:rPr>
+                            <w:b/>
+                            <w:color w:val="2F2F2F"/>
+                            <w:position w:val="4"/>
+                            <w:sz w:val="20"/>
+                            <w:szCs w:val="20"/>
+                            <w:lang w:val="es-ES"/>
+                          </w:rPr>
+                          <w:t>é</w:t>
+                        </w:r>
+                        <w:r>
+                          <w:rPr>
+                            <w:b/>
+                            <w:color w:val="2F2F2F"/>
+                            <w:position w:val="4"/>
+                            <w:sz w:val="20"/>
+                            <w:szCs w:val="20"/>
+                            <w:lang w:val="es-ES"/>
+                          </w:rPr>
+                          <w:t>veloppement</w:t>
+                        </w:r>
+                      </w:p>
+                    </w:txbxContent>
+                  </v:textbox>
+                </v:shape>
+                <v:shape id="_x0000_s1049" type="#_x0000_t202" style="position:absolute;top:5682;width:19926;height:2916;visibility:visible;mso-wrap-style:square;v-text-anchor:top" o:gfxdata="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" filled="f" stroked="f">
+                  <v:textbox>
+                    <w:txbxContent>
+                      <w:p>
+                        <w:pPr>
+                          <w:rPr>
+                            <w:color w:val="2F2F2F"/>
+                            <w:sz w:val="20"/>
+                            <w:szCs w:val="20"/>
+                          </w:rPr>
+                        </w:pPr>
+                        <w:proofErr w:type="spellStart"/>
+                        <w:r>
+                          <w:rPr>
+                            <w:color w:val="2F2F2F"/>
+                            <w:sz w:val="20"/>
+                            <w:szCs w:val="20"/>
+                            <w:lang w:val="es-ES"/>
+                          </w:rPr>
+                          <w:t>Université</w:t>
+                        </w:r>
+                        <w:proofErr w:type="spellEnd"/>
+                        <w:r>
+                          <w:rPr>
+                            <w:color w:val="2F2F2F"/>
+                            <w:sz w:val="20"/>
+                            <w:szCs w:val="20"/>
+                            <w:lang w:val="es-ES"/>
+                          </w:rPr>
+                          <w:t xml:space="preserve"> </w:t>
+                        </w:r>
+                        <w:proofErr w:type="spellStart"/>
+                        <w:r>
+                          <w:rPr>
+                            <w:color w:val="2F2F2F"/>
+                            <w:sz w:val="20"/>
+                            <w:szCs w:val="20"/>
+                            <w:lang w:val="es-ES"/>
+                          </w:rPr>
+                          <w:t>Catholique</w:t>
+                        </w:r>
+                        <w:proofErr w:type="spellEnd"/>
+                        <w:r>
+                          <w:rPr>
+                            <w:color w:val="2F2F2F"/>
+                            <w:sz w:val="20"/>
+                            <w:szCs w:val="20"/>
+                            <w:lang w:val="es-ES"/>
+                          </w:rPr>
+                          <w:t xml:space="preserve"> du Congo</w:t>
+                        </w:r>
+                      </w:p>
+                    </w:txbxContent>
+                  </v:textbox>
+                </v:shape>
+                <v:shape id="_x0000_s1050" type="#_x0000_t202" style="position:absolute;left:26838;top:3839;width:17056;height:2610;visibility:visible;mso-wrap-style:square;v-text-anchor:top" o:gfxdata="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" filled="f" stroked="f">
+                  <v:textbox>
+                    <w:txbxContent>
+                      <w:p>
+                        <w:pPr>
+                          <w:jc w:val="right"/>
+                          <w:rPr>
+                            <w:color w:val="2F2F2F"/>
+                            <w:sz w:val="20"/>
+                            <w:szCs w:val="20"/>
+                            <w:lang w:val="fr-FR"/>
+                          </w:rPr>
+                        </w:pPr>
+                        <w:r>
+                          <w:rPr>
+                            <w:color w:val="2F2F2F"/>
+                            <w:position w:val="-4"/>
+                            <w:sz w:val="20"/>
+                            <w:szCs w:val="20"/>
+                            <w:lang w:val="fr-FR"/>
+                          </w:rPr>
+                          <w:t>2026 En cours</w:t>
+                        </w:r>
+                      </w:p>
+                    </w:txbxContent>
+                  </v:textbox>
+                </v:shape>
+                <v:shape id="_x0000_s1051" type="#_x0000_t202" style="position:absolute;left:118;top:7886;width:40196;height:3320;visibility:visible;mso-wrap-style:square;v-text-anchor:top" o:gfxdata="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" filled="f" stroked="f">
+                  <v:textbox>
+                    <w:txbxContent>
+                      <w:p>
+                        <w:pPr>
+                          <w:pStyle w:val="Corpsdetexte"/>
+                          <w:spacing w:before="101"/>
+                          <w:ind w:right="98"/>
+                          <w:rPr>
+                            <w:color w:val="262626" w:themeColor="text1" w:themeTint="D9"/>
+                            <w:sz w:val="20"/>
+                            <w:szCs w:val="20"/>
+                            <w:lang w:val="es-ES"/>
+                          </w:rPr>
+                        </w:pPr>
+                        <w:proofErr w:type="spellStart"/>
+                        <w:r>
+                          <w:rPr>
+                            <w:b/>
+                            <w:color w:val="2F2F2F"/>
+                            <w:position w:val="4"/>
+                            <w:sz w:val="20"/>
+                            <w:szCs w:val="20"/>
+                            <w:lang w:val="es-ES"/>
+                          </w:rPr>
+                          <w:t>Diplôme</w:t>
+                        </w:r>
+                        <w:proofErr w:type="spellEnd"/>
+                        <w:r>
+                          <w:rPr>
+                            <w:b/>
+                            <w:color w:val="2F2F2F"/>
+                            <w:position w:val="4"/>
+                            <w:sz w:val="20"/>
+                            <w:szCs w:val="20"/>
+                            <w:lang w:val="es-ES"/>
+                          </w:rPr>
+                          <w:t xml:space="preserve"> </w:t>
+                        </w:r>
+                        <w:proofErr w:type="spellStart"/>
+                        <w:r>
+                          <w:rPr>
+                            <w:b/>
+                            <w:color w:val="2F2F2F"/>
+                            <w:position w:val="4"/>
+                            <w:sz w:val="20"/>
+                            <w:szCs w:val="20"/>
+                            <w:lang w:val="es-ES"/>
+                          </w:rPr>
+                          <w:t>d’Etat</w:t>
+                        </w:r>
+                        <w:proofErr w:type="spellEnd"/>
+                        <w:r>
+                          <w:rPr>
+                            <w:b/>
+                            <w:color w:val="2F2F2F"/>
+                            <w:position w:val="4"/>
+                            <w:sz w:val="20"/>
+                            <w:szCs w:val="20"/>
+                            <w:lang w:val="es-ES"/>
+                          </w:rPr>
+                          <w:t xml:space="preserve"> | </w:t>
+                        </w:r>
+                        <w:proofErr w:type="spellStart"/>
+                        <w:r>
+                          <w:rPr>
+                            <w:b/>
+                            <w:color w:val="2F2F2F"/>
+                            <w:position w:val="4"/>
+                            <w:sz w:val="20"/>
+                            <w:szCs w:val="20"/>
+                            <w:lang w:val="es-ES"/>
+                          </w:rPr>
+                          <w:t>Commerciale</w:t>
+                        </w:r>
+                        <w:proofErr w:type="spellEnd"/>
+                        <w:r>
+                          <w:rPr>
+                            <w:b/>
+                            <w:color w:val="2F2F2F"/>
+                            <w:position w:val="4"/>
+                            <w:sz w:val="20"/>
+                            <w:szCs w:val="20"/>
+                            <w:lang w:val="es-ES"/>
+                          </w:rPr>
+                          <w:t xml:space="preserve"> et </w:t>
+                        </w:r>
+                        <w:proofErr w:type="spellStart"/>
+                        <w:r>
+                          <w:rPr>
+                            <w:b/>
+                            <w:color w:val="2F2F2F"/>
+                            <w:position w:val="4"/>
+                            <w:sz w:val="20"/>
+                            <w:szCs w:val="20"/>
+                            <w:lang w:val="es-ES"/>
+                          </w:rPr>
+                          <w:t>Gestion</w:t>
+                        </w:r>
+                        <w:proofErr w:type="spellEnd"/>
+                      </w:p>
+                    </w:txbxContent>
+                  </v:textbox>
+                </v:shape>
+                <v:shape id="_x0000_s1052" type="#_x0000_t202" style="position:absolute;top:10824;width:17056;height:3463;visibility:visible;mso-wrap-style:square;v-text-anchor:top" o:gfxdata="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" filled="f" stroked="f">
+                  <v:textbox>
+                    <w:txbxContent>
+                      <w:p>
+                        <w:pPr>
+                          <w:rPr>
+                            <w:color w:val="2F2F2F"/>
+                            <w:sz w:val="20"/>
+                            <w:szCs w:val="20"/>
+                            <w:lang w:val="es-ES"/>
+                          </w:rPr>
+                        </w:pPr>
+                        <w:proofErr w:type="spellStart"/>
+                        <w:r>
+                          <w:rPr>
+                            <w:color w:val="2F2F2F"/>
+                            <w:sz w:val="20"/>
+                            <w:szCs w:val="20"/>
+                            <w:lang w:val="es-ES"/>
+                          </w:rPr>
+                          <w:t>Révérend</w:t>
+                        </w:r>
+                        <w:proofErr w:type="spellEnd"/>
+                        <w:r>
+                          <w:rPr>
+                            <w:color w:val="2F2F2F"/>
+                            <w:sz w:val="20"/>
+                            <w:szCs w:val="20"/>
+                            <w:lang w:val="es-ES"/>
+                          </w:rPr>
+                          <w:t xml:space="preserve"> Kim</w:t>
+                        </w:r>
+                      </w:p>
+                    </w:txbxContent>
+                  </v:textbox>
+                </v:shape>
+                <v:shape id="_x0000_s1053" type="#_x0000_t202" style="position:absolute;left:24581;top:8602;width:19298;height:2610;visibility:visible;mso-wrap-style:square;v-text-anchor:top" o:gfxdata="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" filled="f" stroked="f">
+                  <v:textbox>
+                    <w:txbxContent>
+                      <w:p>
+                        <w:pPr>
+                          <w:jc w:val="right"/>
+                          <w:rPr>
+                            <w:color w:val="2F2F2F"/>
+                            <w:sz w:val="20"/>
+                            <w:szCs w:val="20"/>
+                            <w:lang w:val="fr-FR"/>
+                          </w:rPr>
+                        </w:pPr>
+                        <w:proofErr w:type="spellStart"/>
+                        <w:r>
+                          <w:rPr>
+                            <w:color w:val="2F2F2F"/>
+                            <w:position w:val="-4"/>
+                            <w:sz w:val="20"/>
+                            <w:szCs w:val="20"/>
+                          </w:rPr>
+                          <w:t>Septembre</w:t>
+                        </w:r>
+                        <w:proofErr w:type="spellEnd"/>
+                        <w:r>
+                          <w:rPr>
+                            <w:color w:val="2F2F2F"/>
+                            <w:spacing w:val="6"/>
+                            <w:position w:val="-4"/>
+                            <w:sz w:val="20"/>
+                            <w:szCs w:val="20"/>
+                          </w:rPr>
+                          <w:t xml:space="preserve"> </w:t>
+                        </w:r>
+                        <w:r>
+                          <w:rPr>
+                            <w:color w:val="2F2F2F"/>
+                            <w:position w:val="-4"/>
+                            <w:sz w:val="20"/>
+                            <w:szCs w:val="20"/>
+                          </w:rPr>
+                          <w:t>20</w:t>
+                        </w:r>
+                        <w:r>
+                          <w:rPr>
+                            <w:color w:val="2F2F2F"/>
+                            <w:position w:val="-4"/>
+                            <w:sz w:val="20"/>
+                            <w:szCs w:val="20"/>
+                          </w:rPr>
+                          <w:t>22</w:t>
+                        </w:r>
+                        <w:r>
+                          <w:rPr>
+                            <w:color w:val="2F2F2F"/>
+                            <w:spacing w:val="27"/>
+                            <w:position w:val="-4"/>
+                            <w:sz w:val="20"/>
+                            <w:szCs w:val="20"/>
+                          </w:rPr>
+                          <w:t xml:space="preserve"> </w:t>
+                        </w:r>
+                        <w:r>
+                          <w:rPr>
+                            <w:color w:val="2F2F2F"/>
+                            <w:position w:val="-4"/>
+                            <w:sz w:val="20"/>
+                            <w:szCs w:val="20"/>
+                          </w:rPr>
+                          <w:t>—</w:t>
+                        </w:r>
+                        <w:r>
+                          <w:rPr>
+                            <w:color w:val="2F2F2F"/>
+                            <w:spacing w:val="28"/>
+                            <w:position w:val="-4"/>
+                            <w:sz w:val="20"/>
+                            <w:szCs w:val="20"/>
+                          </w:rPr>
+                          <w:t xml:space="preserve"> </w:t>
+                        </w:r>
+                        <w:r>
+                          <w:rPr>
+                            <w:color w:val="2F2F2F"/>
+                            <w:position w:val="-4"/>
+                            <w:sz w:val="20"/>
+                            <w:szCs w:val="20"/>
+                          </w:rPr>
+                          <w:t>Juin</w:t>
+                        </w:r>
+                        <w:r>
+                          <w:rPr>
+                            <w:color w:val="2F2F2F"/>
+                            <w:spacing w:val="6"/>
+                            <w:position w:val="-4"/>
+                            <w:sz w:val="20"/>
+                            <w:szCs w:val="20"/>
+                          </w:rPr>
+                          <w:t xml:space="preserve"> </w:t>
+                        </w:r>
+                        <w:r>
+                          <w:rPr>
+                            <w:color w:val="2F2F2F"/>
+                            <w:position w:val="-4"/>
+                            <w:sz w:val="20"/>
+                            <w:szCs w:val="20"/>
+                          </w:rPr>
+                          <w:t>20</w:t>
+                        </w:r>
+                        <w:r>
+                          <w:rPr>
+                            <w:color w:val="2F2F2F"/>
+                            <w:position w:val="-4"/>
+                            <w:sz w:val="20"/>
+                            <w:szCs w:val="20"/>
+                          </w:rPr>
+                          <w:t>23</w:t>
+                        </w:r>
+                      </w:p>
+                    </w:txbxContent>
+                  </v:textbox>
+                </v:shape>
+              </v:group>
+            </w:pict>
+          </mc:Fallback>
+        </mc:AlternateContent>
+      </w:r>
+      <w:r>
+        <w:rPr>
+          <w:noProof/>
+          <w:sz w:val="20"/>
+          <w14:ligatures w14:val="standardContextual"/>
+        </w:rPr>
+        <mc:AlternateContent>
+          <mc:Choice Requires="wpg">
+            <w:drawing>
               <wp:anchor distT="0" distB="0" distL="114300" distR="114300" simplePos="0" relativeHeight="251697152" behindDoc="0" locked="0" layoutInCell="1" allowOverlap="1" wp14:anchorId="741FA69D" wp14:editId="00D53E01">
                 <wp:simplePos x="0" y="0"/>
                 <wp:positionH relativeFrom="column">
@@ -2608,9 +4387,9 @@
           </mc:Choice>
           <mc:Fallback>
             <w:pict>
-              <v:group w14:anchorId="741FA69D" id="Groupe 5" o:spid="_x0000_s1039" style="position:absolute;margin-left:177pt;margin-top:407.35pt;width:340.7pt;height:129pt;z-index:251697152;mso-width-relative:margin;mso-height-relative:margin" coordorigin="" coordsize="43268,17686" o:gfxdata="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">
-                <v:group id="_x0000_s1040" style="position:absolute;width:42652;height:3396" coordorigin="" coordsize="42652,3396" o:gfxdata="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">
-                  <v:shape id="_x0000_s1041" type="#_x0000_t202" style="position:absolute;width:26729;height:3098;visibility:visible;mso-wrap-style:square;v-text-anchor:top" o:gfxdata="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" filled="f" stroked="f">
+              <v:group w14:anchorId="741FA69D" id="Groupe 5" o:spid="_x0000_s1054" style="position:absolute;margin-left:177pt;margin-top:407.35pt;width:340.7pt;height:129pt;z-index:251697152;mso-width-relative:margin;mso-height-relative:margin" coordorigin="" coordsize="43268,17686" o:gfxdata="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">
+                <v:group id="_x0000_s1055" style="position:absolute;width:42652;height:3396" coordorigin="" coordsize="42652,3396" o:gfxdata="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">
+                  <v:shape id="_x0000_s1056" type="#_x0000_t202" style="position:absolute;width:26729;height:3098;visibility:visible;mso-wrap-style:square;v-text-anchor:top" o:gfxdata="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" filled="f" stroked="f">
                     <v:textbox>
                       <w:txbxContent>
                         <w:p>
@@ -2662,14 +4441,14 @@
                       </w:txbxContent>
                     </v:textbox>
                   </v:shape>
-                  <v:line id="Connecteur droit 3" o:spid="_x0000_s1042" style="position:absolute;visibility:visible;mso-wrap-style:square" from="831,3396" to="42652,3396" o:connectortype="straight" o:gfxdata="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" strokecolor="#bfbfbf [2412]" strokeweight=".5pt">
+                  <v:line id="Connecteur droit 3" o:spid="_x0000_s1057" style="position:absolute;visibility:visible;mso-wrap-style:square" from="831,3396" to="42652,3396" o:connectortype="straight" o:gfxdata="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" strokecolor="#bfbfbf [2412]" strokeweight=".5pt">
                     <v:stroke joinstyle="miter"/>
                   </v:line>
-                  <v:line id="Connecteur droit 3" o:spid="_x0000_s1043" style="position:absolute;visibility:visible;mso-wrap-style:square" from="831,475" to="42652,475" o:connectortype="straight" o:gfxdata="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" strokecolor="#bfbfbf [2412]" strokeweight=".5pt">
+                  <v:line id="Connecteur droit 3" o:spid="_x0000_s1058" style="position:absolute;visibility:visible;mso-wrap-style:square" from="831,475" to="42652,475" o:connectortype="straight" o:gfxdata="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" strokecolor="#bfbfbf [2412]" strokeweight=".5pt">
                     <v:stroke joinstyle="miter"/>
                   </v:line>
                 </v:group>
-                <v:shape id="_x0000_s1044" type="#_x0000_t202" style="position:absolute;top:3396;width:43268;height:14290;visibility:visible;mso-wrap-style:square;v-text-anchor:top" o:gfxdata="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" filled="f" stroked="f">
+                <v:shape id="_x0000_s1059" type="#_x0000_t202" style="position:absolute;top:3396;width:43268;height:14290;visibility:visible;mso-wrap-style:square;v-text-anchor:top" o:gfxdata="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" filled="f" stroked="f">
                   <v:textbox>
                     <w:txbxContent>
                       <w:p>
@@ -2855,7 +4634,7 @@
         <mc:AlternateContent>
           <mc:Choice Requires="wpg">
             <w:drawing>
-              <wp:anchor distT="0" distB="0" distL="114300" distR="114300" simplePos="0" relativeHeight="251670528" behindDoc="0" locked="0" layoutInCell="1" allowOverlap="1" wp14:anchorId="32299A94" wp14:editId="02161761">
+              <wp:anchor distT="0" distB="0" distL="114300" distR="114300" simplePos="0" relativeHeight="251670528" behindDoc="0" locked="0" layoutInCell="1" allowOverlap="1" wp14:anchorId="32299A94" wp14:editId="36A18106">
                 <wp:simplePos x="0" y="0"/>
                 <wp:positionH relativeFrom="column">
                   <wp:posOffset>-142875</wp:posOffset>
@@ -3233,8 +5012,8 @@
           </mc:Choice>
           <mc:Fallback>
             <w:pict>
-              <v:group w14:anchorId="32299A94" id="Groupe 2" o:spid="_x0000_s1045" style="position:absolute;margin-left:-11.25pt;margin-top:279.85pt;width:172.2pt;height:146.25pt;z-index:251670528;mso-height-relative:margin" coordsize="21869,18573" o:gfxdata="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">
-                <v:shape id="_x0000_s1046" type="#_x0000_t202" style="position:absolute;left:95;width:17056;height:3098;visibility:visible;mso-wrap-style:square;v-text-anchor:top" o:gfxdata="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" filled="f" stroked="f">
+              <v:group w14:anchorId="32299A94" id="Groupe 2" o:spid="_x0000_s1060" style="position:absolute;margin-left:-11.25pt;margin-top:279.85pt;width:172.2pt;height:146.25pt;z-index:251670528;mso-height-relative:margin" coordsize="21869,18573" o:gfxdata="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">
+                <v:shape id="_x0000_s1061" type="#_x0000_t202" style="position:absolute;left:95;width:17056;height:3098;visibility:visible;mso-wrap-style:square;v-text-anchor:top" o:gfxdata="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" filled="f" stroked="f">
                   <v:textbox>
                     <w:txbxContent>
                       <w:p>
@@ -3286,13 +5065,13 @@
                     </w:txbxContent>
                   </v:textbox>
                 </v:shape>
-                <v:line id="Connecteur droit 3" o:spid="_x0000_s1047" style="position:absolute;visibility:visible;mso-wrap-style:square" from="1047,3048" to="21812,3048" o:connectortype="straight" o:gfxdata="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" strokecolor="#bfbfbf [2412]" strokeweight=".5pt">
+                <v:line id="Connecteur droit 3" o:spid="_x0000_s1062" style="position:absolute;visibility:visible;mso-wrap-style:square" from="1047,3048" to="21812,3048" o:connectortype="straight" o:gfxdata="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" strokecolor="#bfbfbf [2412]" strokeweight=".5pt">
                   <v:stroke joinstyle="miter"/>
                 </v:line>
-                <v:line id="Connecteur droit 3" o:spid="_x0000_s1048" style="position:absolute;visibility:visible;mso-wrap-style:square" from="1047,381" to="21774,381" o:connectortype="straight" o:gfxdata="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" strokecolor="#bfbfbf [2412]" strokeweight=".5pt">
+                <v:line id="Connecteur droit 3" o:spid="_x0000_s1063" style="position:absolute;visibility:visible;mso-wrap-style:square" from="1047,381" to="21774,381" o:connectortype="straight" o:gfxdata="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" strokecolor="#bfbfbf [2412]" strokeweight=".5pt">
                   <v:stroke joinstyle="miter"/>
                 </v:line>
-                <v:shape id="_x0000_s1049" type="#_x0000_t202" style="position:absolute;top:2381;width:21869;height:16192;visibility:visible;mso-wrap-style:square;v-text-anchor:top" o:gfxdata="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" filled="f" stroked="f">
+                <v:shape id="_x0000_s1064" type="#_x0000_t202" style="position:absolute;top:2381;width:21869;height:16192;visibility:visible;mso-wrap-style:square;v-text-anchor:top" o:gfxdata="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" filled="f" stroked="f">
                   <v:textbox>
                     <w:txbxContent>
                       <w:p>
@@ -3480,628 +5259,7 @@
         <mc:AlternateContent>
           <mc:Choice Requires="wpg">
             <w:drawing>
-              <wp:anchor distT="0" distB="0" distL="114300" distR="114300" simplePos="0" relativeHeight="251689984" behindDoc="0" locked="0" layoutInCell="1" allowOverlap="1" wp14:anchorId="1918F670" wp14:editId="6A7CBC62">
-                <wp:simplePos x="0" y="0"/>
-                <wp:positionH relativeFrom="column">
-                  <wp:posOffset>-142875</wp:posOffset>
-                </wp:positionH>
-                <wp:positionV relativeFrom="paragraph">
-                  <wp:posOffset>5424841</wp:posOffset>
-                </wp:positionV>
-                <wp:extent cx="2186940" cy="1390651"/>
-                <wp:effectExtent l="0" t="0" r="22860" b="0"/>
-                <wp:wrapNone/>
-                <wp:docPr id="656231994" name="Groupe 3"/>
-                <wp:cNvGraphicFramePr/>
-                <a:graphic xmlns:a="http://schemas.openxmlformats.org/drawingml/2006/main">
-                  <a:graphicData uri="http://schemas.microsoft.com/office/word/2010/wordprocessingGroup">
-                    <wpg:wgp>
-                      <wpg:cNvGrpSpPr/>
-                      <wpg:grpSpPr>
-                        <a:xfrm>
-                          <a:off x="0" y="0"/>
-                          <a:ext cx="2186940" cy="1390651"/>
-                          <a:chOff x="0" y="0"/>
-                          <a:chExt cx="2186940" cy="1390651"/>
-                        </a:xfrm>
-                      </wpg:grpSpPr>
-                      <wps:wsp>
-                        <wps:cNvPr id="558982198" name="Zone de texte 2"/>
-                        <wps:cNvSpPr txBox="1">
-                          <a:spLocks noChangeArrowheads="1"/>
-                        </wps:cNvSpPr>
-                        <wps:spPr bwMode="auto">
-                          <a:xfrm>
-                            <a:off x="9525" y="0"/>
-                            <a:ext cx="1705610" cy="309880"/>
-                          </a:xfrm>
-                          <a:prstGeom prst="rect">
-                            <a:avLst/>
-                          </a:prstGeom>
-                          <a:noFill/>
-                          <a:ln w="9525">
-                            <a:noFill/>
-                            <a:miter lim="800000"/>
-                            <a:headEnd/>
-                            <a:tailEnd/>
-                          </a:ln>
-                        </wps:spPr>
-                        <wps:txbx>
-                          <w:txbxContent>
-                            <w:p>
-                              <w:pPr>
-                                <w:pStyle w:val="Corpsdetexte"/>
-                                <w:spacing w:before="101"/>
-                                <w:ind w:right="98"/>
-                                <w:rPr>
-                                  <w:rFonts w:ascii="Trebuchet MS"/>
-                                  <w:color w:val="262626" w:themeColor="text1" w:themeTint="D9"/>
-                                  <w:w w:val="95"/>
-                                  <w:sz w:val="20"/>
-                                  <w:szCs w:val="20"/>
-                                  <w:lang w:val="es-ES"/>
-                                </w:rPr>
-                              </w:pPr>
-                              <w:r>
-                                <w:rPr>
-                                  <w:rFonts w:ascii="Trebuchet MS"/>
-                                  <w:color w:val="262626" w:themeColor="text1" w:themeTint="D9"/>
-                                  <w:w w:val="95"/>
-                                  <w:sz w:val="20"/>
-                                  <w:szCs w:val="20"/>
-                                  <w:lang w:val="es-ES"/>
-                                </w:rPr>
-                                <w:t>CENTRES D</w:t>
-                              </w:r>
-                              <w:r>
-                                <w:rPr>
-                                  <w:rFonts w:ascii="Trebuchet MS"/>
-                                  <w:color w:val="262626" w:themeColor="text1" w:themeTint="D9"/>
-                                  <w:w w:val="95"/>
-                                  <w:sz w:val="20"/>
-                                  <w:szCs w:val="20"/>
-                                  <w:lang w:val="es-ES"/>
-                                </w:rPr>
-                                <w:t>’</w:t>
-                              </w:r>
-                              <w:r>
-                                <w:rPr>
-                                  <w:rFonts w:ascii="Trebuchet MS"/>
-                                  <w:color w:val="262626" w:themeColor="text1" w:themeTint="D9"/>
-                                  <w:w w:val="95"/>
-                                  <w:sz w:val="20"/>
-                                  <w:szCs w:val="20"/>
-                                  <w:lang w:val="es-ES"/>
-                                </w:rPr>
-                                <w:t>INT</w:t>
-                              </w:r>
-                              <w:r>
-                                <w:rPr>
-                                  <w:rFonts w:ascii="Trebuchet MS"/>
-                                  <w:color w:val="262626" w:themeColor="text1" w:themeTint="D9"/>
-                                  <w:w w:val="95"/>
-                                  <w:sz w:val="20"/>
-                                  <w:szCs w:val="20"/>
-                                  <w:lang w:val="es-ES"/>
-                                </w:rPr>
-                                <w:t>É</w:t>
-                              </w:r>
-                              <w:r>
-                                <w:rPr>
-                                  <w:rFonts w:ascii="Trebuchet MS"/>
-                                  <w:color w:val="262626" w:themeColor="text1" w:themeTint="D9"/>
-                                  <w:w w:val="95"/>
-                                  <w:sz w:val="20"/>
-                                  <w:szCs w:val="20"/>
-                                  <w:lang w:val="es-ES"/>
-                                </w:rPr>
-                                <w:t>R</w:t>
-                              </w:r>
-                              <w:r>
-                                <w:rPr>
-                                  <w:rFonts w:ascii="Trebuchet MS"/>
-                                  <w:color w:val="262626" w:themeColor="text1" w:themeTint="D9"/>
-                                  <w:w w:val="95"/>
-                                  <w:sz w:val="20"/>
-                                  <w:szCs w:val="20"/>
-                                  <w:lang w:val="es-ES"/>
-                                </w:rPr>
-                                <w:t>Ê</w:t>
-                              </w:r>
-                              <w:r>
-                                <w:rPr>
-                                  <w:rFonts w:ascii="Trebuchet MS"/>
-                                  <w:color w:val="262626" w:themeColor="text1" w:themeTint="D9"/>
-                                  <w:w w:val="95"/>
-                                  <w:sz w:val="20"/>
-                                  <w:szCs w:val="20"/>
-                                  <w:lang w:val="es-ES"/>
-                                </w:rPr>
-                                <w:t>T</w:t>
-                              </w:r>
-                            </w:p>
-                          </w:txbxContent>
-                        </wps:txbx>
-                        <wps:bodyPr rot="0" vert="horz" wrap="square" lIns="91440" tIns="45720" rIns="91440" bIns="45720" anchor="t" anchorCtr="0">
-                          <a:noAutofit/>
-                        </wps:bodyPr>
-                      </wps:wsp>
-                      <wps:wsp>
-                        <wps:cNvPr id="1657039949" name="Connecteur droit 3"/>
-                        <wps:cNvCnPr/>
-                        <wps:spPr>
-                          <a:xfrm>
-                            <a:off x="95250" y="314325"/>
-                            <a:ext cx="2076450" cy="0"/>
-                          </a:xfrm>
-                          <a:prstGeom prst="line">
-                            <a:avLst/>
-                          </a:prstGeom>
-                          <a:ln>
-                            <a:solidFill>
-                              <a:schemeClr val="bg1">
-                                <a:lumMod val="75000"/>
-                              </a:schemeClr>
-                            </a:solidFill>
-                          </a:ln>
-                        </wps:spPr>
-                        <wps:style>
-                          <a:lnRef idx="1">
-                            <a:schemeClr val="accent1"/>
-                          </a:lnRef>
-                          <a:fillRef idx="0">
-                            <a:schemeClr val="accent1"/>
-                          </a:fillRef>
-                          <a:effectRef idx="0">
-                            <a:schemeClr val="accent1"/>
-                          </a:effectRef>
-                          <a:fontRef idx="minor">
-                            <a:schemeClr val="tx1"/>
-                          </a:fontRef>
-                        </wps:style>
-                        <wps:bodyPr/>
-                      </wps:wsp>
-                      <wps:wsp>
-                        <wps:cNvPr id="1209884258" name="Connecteur droit 3"/>
-                        <wps:cNvCnPr/>
-                        <wps:spPr>
-                          <a:xfrm>
-                            <a:off x="104775" y="47625"/>
-                            <a:ext cx="2072640" cy="0"/>
-                          </a:xfrm>
-                          <a:prstGeom prst="line">
-                            <a:avLst/>
-                          </a:prstGeom>
-                          <a:ln>
-                            <a:solidFill>
-                              <a:schemeClr val="bg1">
-                                <a:lumMod val="75000"/>
-                              </a:schemeClr>
-                            </a:solidFill>
-                          </a:ln>
-                        </wps:spPr>
-                        <wps:style>
-                          <a:lnRef idx="1">
-                            <a:schemeClr val="accent1"/>
-                          </a:lnRef>
-                          <a:fillRef idx="0">
-                            <a:schemeClr val="accent1"/>
-                          </a:fillRef>
-                          <a:effectRef idx="0">
-                            <a:schemeClr val="accent1"/>
-                          </a:effectRef>
-                          <a:fontRef idx="minor">
-                            <a:schemeClr val="tx1"/>
-                          </a:fontRef>
-                        </wps:style>
-                        <wps:bodyPr/>
-                      </wps:wsp>
-                      <wps:wsp>
-                        <wps:cNvPr id="59459744" name="Zone de texte 2"/>
-                        <wps:cNvSpPr txBox="1">
-                          <a:spLocks noChangeArrowheads="1"/>
-                        </wps:cNvSpPr>
-                        <wps:spPr bwMode="auto">
-                          <a:xfrm>
-                            <a:off x="0" y="323851"/>
-                            <a:ext cx="2186940" cy="1066800"/>
-                          </a:xfrm>
-                          <a:prstGeom prst="rect">
-                            <a:avLst/>
-                          </a:prstGeom>
-                          <a:noFill/>
-                          <a:ln w="9525">
-                            <a:noFill/>
-                            <a:miter lim="800000"/>
-                            <a:headEnd/>
-                            <a:tailEnd/>
-                          </a:ln>
-                        </wps:spPr>
-                        <wps:txbx>
-                          <w:txbxContent>
-                            <w:p>
-                              <w:pPr>
-                                <w:tabs>
-                                  <w:tab w:val="left" w:pos="300"/>
-                                </w:tabs>
-                                <w:spacing w:before="114" w:line="276" w:lineRule="auto"/>
-                                <w:ind w:right="191"/>
-                                <w:rPr>
-                                  <w:color w:val="A6A6A6" w:themeColor="background1" w:themeShade="A6"/>
-                                  <w:sz w:val="20"/>
-                                  <w:szCs w:val="28"/>
-                                  <w:lang w:val="fr-FR"/>
-                                </w:rPr>
-                              </w:pPr>
-                              <w:r>
-                                <w:rPr>
-                                  <w:color w:val="A6A6A6" w:themeColor="background1" w:themeShade="A6"/>
-                                  <w:sz w:val="20"/>
-                                  <w:szCs w:val="28"/>
-                                  <w:lang w:val="fr-FR"/>
-                                </w:rPr>
-                                <w:t>Football</w:t>
-                              </w:r>
-                            </w:p>
-                            <w:p>
-                              <w:pPr>
-                                <w:tabs>
-                                  <w:tab w:val="left" w:pos="300"/>
-                                </w:tabs>
-                                <w:spacing w:before="114" w:line="276" w:lineRule="auto"/>
-                                <w:ind w:right="191"/>
-                                <w:rPr>
-                                  <w:color w:val="A6A6A6" w:themeColor="background1" w:themeShade="A6"/>
-                                  <w:sz w:val="20"/>
-                                  <w:szCs w:val="28"/>
-                                  <w:lang w:val="fr-FR"/>
-                                </w:rPr>
-                              </w:pPr>
-                              <w:r>
-                                <w:rPr>
-                                  <w:color w:val="A6A6A6" w:themeColor="background1" w:themeShade="A6"/>
-                                  <w:sz w:val="20"/>
-                                  <w:szCs w:val="28"/>
-                                  <w:lang w:val="fr-FR"/>
-                                </w:rPr>
-                                <w:t>Musique</w:t>
-                              </w:r>
-                            </w:p>
-                            <w:p>
-                              <w:pPr>
-                                <w:tabs>
-                                  <w:tab w:val="left" w:pos="300"/>
-                                </w:tabs>
-                                <w:spacing w:before="114" w:line="276" w:lineRule="auto"/>
-                                <w:ind w:right="191"/>
-                                <w:rPr>
-                                  <w:color w:val="A6A6A6" w:themeColor="background1" w:themeShade="A6"/>
-                                  <w:sz w:val="20"/>
-                                  <w:szCs w:val="28"/>
-                                  <w:lang w:val="fr-FR"/>
-                                </w:rPr>
-                              </w:pPr>
-                              <w:r>
-                                <w:rPr>
-                                  <w:color w:val="A6A6A6" w:themeColor="background1" w:themeShade="A6"/>
-                                  <w:sz w:val="20"/>
-                                  <w:szCs w:val="28"/>
-                                  <w:lang w:val="fr-FR"/>
-                                </w:rPr>
-                                <w:t>Musculation</w:t>
-                              </w:r>
-                            </w:p>
-                            <w:p>
-                              <w:pPr>
-                                <w:tabs>
-                                  <w:tab w:val="left" w:pos="300"/>
-                                </w:tabs>
-                                <w:spacing w:before="114" w:line="276" w:lineRule="auto"/>
-                                <w:ind w:right="191"/>
-                                <w:rPr>
-                                  <w:color w:val="A6A6A6" w:themeColor="background1" w:themeShade="A6"/>
-                                  <w:sz w:val="20"/>
-                                  <w:szCs w:val="28"/>
-                                  <w:lang w:val="fr-FR"/>
-                                </w:rPr>
-                              </w:pPr>
-                              <w:r>
-                                <w:rPr>
-                                  <w:color w:val="A6A6A6" w:themeColor="background1" w:themeShade="A6"/>
-                                  <w:sz w:val="20"/>
-                                  <w:szCs w:val="28"/>
-                                  <w:lang w:val="fr-FR"/>
-                                </w:rPr>
-                                <w:t>Intelligence</w:t>
-                              </w:r>
-                              <w:r>
-                                <w:rPr>
-                                  <w:color w:val="A6A6A6" w:themeColor="background1" w:themeShade="A6"/>
-                                  <w:sz w:val="20"/>
-                                  <w:szCs w:val="28"/>
-                                  <w:lang w:val="fr-FR"/>
-                                </w:rPr>
-                                <w:t xml:space="preserve"> Artificielle</w:t>
-                              </w:r>
-                            </w:p>
-                            <w:p>
-                              <w:pPr>
-                                <w:tabs>
-                                  <w:tab w:val="left" w:pos="300"/>
-                                </w:tabs>
-                                <w:spacing w:before="114" w:line="276" w:lineRule="auto"/>
-                                <w:ind w:right="191"/>
-                                <w:rPr>
-                                  <w:color w:val="A6A6A6" w:themeColor="background1" w:themeShade="A6"/>
-                                  <w:sz w:val="20"/>
-                                  <w:szCs w:val="28"/>
-                                  <w:lang w:val="fr-FR"/>
-                                </w:rPr>
-                              </w:pPr>
-                            </w:p>
-                          </w:txbxContent>
-                        </wps:txbx>
-                        <wps:bodyPr rot="0" vert="horz" wrap="square" lIns="91440" tIns="45720" rIns="91440" bIns="45720" anchor="t" anchorCtr="0">
-                          <a:noAutofit/>
-                        </wps:bodyPr>
-                      </wps:wsp>
-                    </wpg:wgp>
-                  </a:graphicData>
-                </a:graphic>
-                <wp14:sizeRelV relativeFrom="margin">
-                  <wp14:pctHeight>0</wp14:pctHeight>
-                </wp14:sizeRelV>
-              </wp:anchor>
-            </w:drawing>
-          </mc:Choice>
-          <mc:Fallback>
-            <w:pict>
-              <v:group w14:anchorId="1918F670" id="Groupe 3" o:spid="_x0000_s1050" style="position:absolute;margin-left:-11.25pt;margin-top:427.15pt;width:172.2pt;height:109.5pt;z-index:251689984;mso-height-relative:margin" coordsize="21869,13906" o:gfxdata="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">
-                <v:shape id="_x0000_s1051" type="#_x0000_t202" style="position:absolute;left:95;width:17056;height:3098;visibility:visible;mso-wrap-style:square;v-text-anchor:top" o:gfxdata="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" filled="f" stroked="f">
-                  <v:textbox>
-                    <w:txbxContent>
-                      <w:p>
-                        <w:pPr>
-                          <w:pStyle w:val="Corpsdetexte"/>
-                          <w:spacing w:before="101"/>
-                          <w:ind w:right="98"/>
-                          <w:rPr>
-                            <w:rFonts w:ascii="Trebuchet MS"/>
-                            <w:color w:val="262626" w:themeColor="text1" w:themeTint="D9"/>
-                            <w:w w:val="95"/>
-                            <w:sz w:val="20"/>
-                            <w:szCs w:val="20"/>
-                            <w:lang w:val="es-ES"/>
-                          </w:rPr>
-                        </w:pPr>
-                        <w:r>
-                          <w:rPr>
-                            <w:rFonts w:ascii="Trebuchet MS"/>
-                            <w:color w:val="262626" w:themeColor="text1" w:themeTint="D9"/>
-                            <w:w w:val="95"/>
-                            <w:sz w:val="20"/>
-                            <w:szCs w:val="20"/>
-                            <w:lang w:val="es-ES"/>
-                          </w:rPr>
-                          <w:t>CENTRES D</w:t>
-                        </w:r>
-                        <w:r>
-                          <w:rPr>
-                            <w:rFonts w:ascii="Trebuchet MS"/>
-                            <w:color w:val="262626" w:themeColor="text1" w:themeTint="D9"/>
-                            <w:w w:val="95"/>
-                            <w:sz w:val="20"/>
-                            <w:szCs w:val="20"/>
-                            <w:lang w:val="es-ES"/>
-                          </w:rPr>
-                          <w:t>’</w:t>
-                        </w:r>
-                        <w:r>
-                          <w:rPr>
-                            <w:rFonts w:ascii="Trebuchet MS"/>
-                            <w:color w:val="262626" w:themeColor="text1" w:themeTint="D9"/>
-                            <w:w w:val="95"/>
-                            <w:sz w:val="20"/>
-                            <w:szCs w:val="20"/>
-                            <w:lang w:val="es-ES"/>
-                          </w:rPr>
-                          <w:t>INT</w:t>
-                        </w:r>
-                        <w:r>
-                          <w:rPr>
-                            <w:rFonts w:ascii="Trebuchet MS"/>
-                            <w:color w:val="262626" w:themeColor="text1" w:themeTint="D9"/>
-                            <w:w w:val="95"/>
-                            <w:sz w:val="20"/>
-                            <w:szCs w:val="20"/>
-                            <w:lang w:val="es-ES"/>
-                          </w:rPr>
-                          <w:t>É</w:t>
-                        </w:r>
-                        <w:r>
-                          <w:rPr>
-                            <w:rFonts w:ascii="Trebuchet MS"/>
-                            <w:color w:val="262626" w:themeColor="text1" w:themeTint="D9"/>
-                            <w:w w:val="95"/>
-                            <w:sz w:val="20"/>
-                            <w:szCs w:val="20"/>
-                            <w:lang w:val="es-ES"/>
-                          </w:rPr>
-                          <w:t>R</w:t>
-                        </w:r>
-                        <w:r>
-                          <w:rPr>
-                            <w:rFonts w:ascii="Trebuchet MS"/>
-                            <w:color w:val="262626" w:themeColor="text1" w:themeTint="D9"/>
-                            <w:w w:val="95"/>
-                            <w:sz w:val="20"/>
-                            <w:szCs w:val="20"/>
-                            <w:lang w:val="es-ES"/>
-                          </w:rPr>
-                          <w:t>Ê</w:t>
-                        </w:r>
-                        <w:r>
-                          <w:rPr>
-                            <w:rFonts w:ascii="Trebuchet MS"/>
-                            <w:color w:val="262626" w:themeColor="text1" w:themeTint="D9"/>
-                            <w:w w:val="95"/>
-                            <w:sz w:val="20"/>
-                            <w:szCs w:val="20"/>
-                            <w:lang w:val="es-ES"/>
-                          </w:rPr>
-                          <w:t>T</w:t>
-                        </w:r>
-                      </w:p>
-                    </w:txbxContent>
-                  </v:textbox>
-                </v:shape>
-                <v:line id="Connecteur droit 3" o:spid="_x0000_s1052" style="position:absolute;visibility:visible;mso-wrap-style:square" from="952,3143" to="21717,3143" o:connectortype="straight" o:gfxdata="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" strokecolor="#bfbfbf [2412]" strokeweight=".5pt">
-                  <v:stroke joinstyle="miter"/>
-                </v:line>
-                <v:line id="Connecteur droit 3" o:spid="_x0000_s1053" style="position:absolute;visibility:visible;mso-wrap-style:square" from="1047,476" to="21774,476" o:connectortype="straight" o:gfxdata="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" strokecolor="#bfbfbf [2412]" strokeweight=".5pt">
-                  <v:stroke joinstyle="miter"/>
-                </v:line>
-                <v:shape id="_x0000_s1054" type="#_x0000_t202" style="position:absolute;top:3238;width:21869;height:10668;visibility:visible;mso-wrap-style:square;v-text-anchor:top" o:gfxdata="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" filled="f" stroked="f">
-                  <v:textbox>
-                    <w:txbxContent>
-                      <w:p>
-                        <w:pPr>
-                          <w:tabs>
-                            <w:tab w:val="left" w:pos="300"/>
-                          </w:tabs>
-                          <w:spacing w:before="114" w:line="276" w:lineRule="auto"/>
-                          <w:ind w:right="191"/>
-                          <w:rPr>
-                            <w:color w:val="A6A6A6" w:themeColor="background1" w:themeShade="A6"/>
-                            <w:sz w:val="20"/>
-                            <w:szCs w:val="28"/>
-                            <w:lang w:val="fr-FR"/>
-                          </w:rPr>
-                        </w:pPr>
-                        <w:r>
-                          <w:rPr>
-                            <w:color w:val="A6A6A6" w:themeColor="background1" w:themeShade="A6"/>
-                            <w:sz w:val="20"/>
-                            <w:szCs w:val="28"/>
-                            <w:lang w:val="fr-FR"/>
-                          </w:rPr>
-                          <w:t>Football</w:t>
-                        </w:r>
-                      </w:p>
-                      <w:p>
-                        <w:pPr>
-                          <w:tabs>
-                            <w:tab w:val="left" w:pos="300"/>
-                          </w:tabs>
-                          <w:spacing w:before="114" w:line="276" w:lineRule="auto"/>
-                          <w:ind w:right="191"/>
-                          <w:rPr>
-                            <w:color w:val="A6A6A6" w:themeColor="background1" w:themeShade="A6"/>
-                            <w:sz w:val="20"/>
-                            <w:szCs w:val="28"/>
-                            <w:lang w:val="fr-FR"/>
-                          </w:rPr>
-                        </w:pPr>
-                        <w:r>
-                          <w:rPr>
-                            <w:color w:val="A6A6A6" w:themeColor="background1" w:themeShade="A6"/>
-                            <w:sz w:val="20"/>
-                            <w:szCs w:val="28"/>
-                            <w:lang w:val="fr-FR"/>
-                          </w:rPr>
-                          <w:t>Musique</w:t>
-                        </w:r>
-                      </w:p>
-                      <w:p>
-                        <w:pPr>
-                          <w:tabs>
-                            <w:tab w:val="left" w:pos="300"/>
-                          </w:tabs>
-                          <w:spacing w:before="114" w:line="276" w:lineRule="auto"/>
-                          <w:ind w:right="191"/>
-                          <w:rPr>
-                            <w:color w:val="A6A6A6" w:themeColor="background1" w:themeShade="A6"/>
-                            <w:sz w:val="20"/>
-                            <w:szCs w:val="28"/>
-                            <w:lang w:val="fr-FR"/>
-                          </w:rPr>
-                        </w:pPr>
-                        <w:r>
-                          <w:rPr>
-                            <w:color w:val="A6A6A6" w:themeColor="background1" w:themeShade="A6"/>
-                            <w:sz w:val="20"/>
-                            <w:szCs w:val="28"/>
-                            <w:lang w:val="fr-FR"/>
-                          </w:rPr>
-                          <w:t>Musculation</w:t>
-                        </w:r>
-                      </w:p>
-                      <w:p>
-                        <w:pPr>
-                          <w:tabs>
-                            <w:tab w:val="left" w:pos="300"/>
-                          </w:tabs>
-                          <w:spacing w:before="114" w:line="276" w:lineRule="auto"/>
-                          <w:ind w:right="191"/>
-                          <w:rPr>
-                            <w:color w:val="A6A6A6" w:themeColor="background1" w:themeShade="A6"/>
-                            <w:sz w:val="20"/>
-                            <w:szCs w:val="28"/>
-                            <w:lang w:val="fr-FR"/>
-                          </w:rPr>
-                        </w:pPr>
-                        <w:r>
-                          <w:rPr>
-                            <w:color w:val="A6A6A6" w:themeColor="background1" w:themeShade="A6"/>
-                            <w:sz w:val="20"/>
-                            <w:szCs w:val="28"/>
-                            <w:lang w:val="fr-FR"/>
-                          </w:rPr>
-                          <w:t>Intelligence</w:t>
-                        </w:r>
-                        <w:r>
-                          <w:rPr>
-                            <w:color w:val="A6A6A6" w:themeColor="background1" w:themeShade="A6"/>
-                            <w:sz w:val="20"/>
-                            <w:szCs w:val="28"/>
-                            <w:lang w:val="fr-FR"/>
-                          </w:rPr>
-                          <w:t xml:space="preserve"> Artificielle</w:t>
-                        </w:r>
-                      </w:p>
-                      <w:p>
-                        <w:pPr>
-                          <w:tabs>
-                            <w:tab w:val="left" w:pos="300"/>
-                          </w:tabs>
-                          <w:spacing w:before="114" w:line="276" w:lineRule="auto"/>
-                          <w:ind w:right="191"/>
-                          <w:rPr>
-                            <w:color w:val="A6A6A6" w:themeColor="background1" w:themeShade="A6"/>
-                            <w:sz w:val="20"/>
-                            <w:szCs w:val="28"/>
-                            <w:lang w:val="fr-FR"/>
-                          </w:rPr>
-                        </w:pPr>
-                      </w:p>
-                    </w:txbxContent>
-                  </v:textbox>
-                </v:shape>
-              </v:group>
-            </w:pict>
-          </mc:Fallback>
-        </mc:AlternateContent>
-      </w:r>
-      <w:r>
-        <w:rPr>
-          <w:noProof/>
-          <w:sz w:val="20"/>
-          <w14:ligatures w14:val="standardContextual"/>
-        </w:rPr>
-        <mc:AlternateContent>
-          <mc:Choice Requires="wpg">
-            <w:drawing>
-              <wp:anchor distT="0" distB="0" distL="114300" distR="114300" simplePos="0" relativeHeight="251668480" behindDoc="0" locked="0" layoutInCell="1" allowOverlap="1" wp14:anchorId="0AB31130" wp14:editId="205E7FF6">
+              <wp:anchor distT="0" distB="0" distL="114300" distR="114300" simplePos="0" relativeHeight="251668480" behindDoc="0" locked="0" layoutInCell="1" allowOverlap="1" wp14:anchorId="0AB31130" wp14:editId="45C86717">
                 <wp:simplePos x="0" y="0"/>
                 <wp:positionH relativeFrom="column">
                   <wp:posOffset>-142875</wp:posOffset>
@@ -4401,8 +5559,8 @@
           </mc:Choice>
           <mc:Fallback>
             <w:pict>
-              <v:group w14:anchorId="0AB31130" id="Groupe 4" o:spid="_x0000_s1055" style="position:absolute;margin-left:-11.25pt;margin-top:183.1pt;width:172.95pt;height:89.25pt;z-index:251668480;mso-height-relative:margin" coordsize="21964,11334" o:gfxdata="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">
-                <v:shape id="_x0000_s1056" type="#_x0000_t202" style="position:absolute;width:20066;height:3098;visibility:visible;mso-wrap-style:square;v-text-anchor:top" o:gfxdata="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" filled="f" stroked="f">
+              <v:group w14:anchorId="0AB31130" id="Groupe 4" o:spid="_x0000_s1065" style="position:absolute;margin-left:-11.25pt;margin-top:183.1pt;width:172.95pt;height:89.25pt;z-index:251668480;mso-height-relative:margin" coordsize="21964,11334" o:gfxdata="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">
+                <v:shape id="_x0000_s1066" type="#_x0000_t202" style="position:absolute;width:20066;height:3098;visibility:visible;mso-wrap-style:square;v-text-anchor:top" o:gfxdata="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" filled="f" stroked="f">
                   <v:textbox>
                     <w:txbxContent>
                       <w:p>
@@ -4432,13 +5590,13 @@
                     </w:txbxContent>
                   </v:textbox>
                 </v:shape>
-                <v:line id="Connecteur droit 3" o:spid="_x0000_s1057" style="position:absolute;visibility:visible;mso-wrap-style:square" from="1047,3048" to="21812,3048" o:connectortype="straight" o:gfxdata="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" strokecolor="#bfbfbf [2412]" strokeweight=".5pt">
+                <v:line id="Connecteur droit 3" o:spid="_x0000_s1067" style="position:absolute;visibility:visible;mso-wrap-style:square" from="1047,3048" to="21812,3048" o:connectortype="straight" o:gfxdata="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" strokecolor="#bfbfbf [2412]" strokeweight=".5pt">
                   <v:stroke joinstyle="miter"/>
                 </v:line>
-                <v:line id="Connecteur droit 3" o:spid="_x0000_s1058" style="position:absolute;visibility:visible;mso-wrap-style:square" from="1047,476" to="21774,476" o:connectortype="straight" o:gfxdata="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" strokecolor="#bfbfbf [2412]" strokeweight=".5pt">
+                <v:line id="Connecteur droit 3" o:spid="_x0000_s1068" style="position:absolute;visibility:visible;mso-wrap-style:square" from="1047,476" to="21774,476" o:connectortype="straight" o:gfxdata="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" strokecolor="#bfbfbf [2412]" strokeweight=".5pt">
                   <v:stroke joinstyle="miter"/>
                 </v:line>
-                <v:shape id="_x0000_s1059" type="#_x0000_t202" style="position:absolute;left:95;top:3143;width:21869;height:8191;visibility:visible;mso-wrap-style:square;v-text-anchor:top" o:gfxdata="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" filled="f" stroked="f">
+                <v:shape id="_x0000_s1069" type="#_x0000_t202" style="position:absolute;left:95;top:3143;width:21869;height:8191;visibility:visible;mso-wrap-style:square;v-text-anchor:top" o:gfxdata="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" filled="f" stroked="f">
                   <v:textbox>
                     <w:txbxContent>
                       <w:p>
@@ -4551,1206 +5709,6 @@
                             <w:lang w:val="fr-FR"/>
                           </w:rPr>
                           <w:t>A2 (élémentaire)</w:t>
-                        </w:r>
-                      </w:p>
-                    </w:txbxContent>
-                  </v:textbox>
-                </v:shape>
-              </v:group>
-            </w:pict>
-          </mc:Fallback>
-        </mc:AlternateContent>
-      </w:r>
-      <w:r>
-        <w:rPr>
-          <w:noProof/>
-          <w:sz w:val="20"/>
-          <w14:ligatures w14:val="standardContextual"/>
-        </w:rPr>
-        <mc:AlternateContent>
-          <mc:Choice Requires="wpg">
-            <w:drawing>
-              <wp:anchor distT="0" distB="0" distL="114300" distR="114300" simplePos="0" relativeHeight="251681792" behindDoc="0" locked="0" layoutInCell="1" allowOverlap="1" wp14:anchorId="74FE1078" wp14:editId="301B5D9C">
-                <wp:simplePos x="0" y="0"/>
-                <wp:positionH relativeFrom="column">
-                  <wp:posOffset>2228850</wp:posOffset>
-                </wp:positionH>
-                <wp:positionV relativeFrom="paragraph">
-                  <wp:posOffset>3977005</wp:posOffset>
-                </wp:positionV>
-                <wp:extent cx="4389120" cy="1106567"/>
-                <wp:effectExtent l="0" t="0" r="0" b="0"/>
-                <wp:wrapNone/>
-                <wp:docPr id="258582367" name="Groupe 3"/>
-                <wp:cNvGraphicFramePr/>
-                <a:graphic xmlns:a="http://schemas.openxmlformats.org/drawingml/2006/main">
-                  <a:graphicData uri="http://schemas.microsoft.com/office/word/2010/wordprocessingGroup">
-                    <wpg:wgp>
-                      <wpg:cNvGrpSpPr/>
-                      <wpg:grpSpPr>
-                        <a:xfrm>
-                          <a:off x="0" y="0"/>
-                          <a:ext cx="4389120" cy="1106567"/>
-                          <a:chOff x="0" y="47501"/>
-                          <a:chExt cx="4389433" cy="1228091"/>
-                        </a:xfrm>
-                      </wpg:grpSpPr>
-                      <wps:wsp>
-                        <wps:cNvPr id="636787075" name="Zone de texte 2"/>
-                        <wps:cNvSpPr txBox="1">
-                          <a:spLocks noChangeArrowheads="1"/>
-                        </wps:cNvSpPr>
-                        <wps:spPr bwMode="auto">
-                          <a:xfrm>
-                            <a:off x="11875" y="49300"/>
-                            <a:ext cx="2305050" cy="309880"/>
-                          </a:xfrm>
-                          <a:prstGeom prst="rect">
-                            <a:avLst/>
-                          </a:prstGeom>
-                          <a:noFill/>
-                          <a:ln w="9525">
-                            <a:noFill/>
-                            <a:miter lim="800000"/>
-                            <a:headEnd/>
-                            <a:tailEnd/>
-                          </a:ln>
-                        </wps:spPr>
-                        <wps:txbx>
-                          <w:txbxContent>
-                            <w:p>
-                              <w:pPr>
-                                <w:pStyle w:val="Corpsdetexte"/>
-                                <w:rPr>
-                                  <w:lang w:val="es-ES"/>
-                                </w:rPr>
-                              </w:pPr>
-                              <w:r>
-                                <w:rPr>
-                                  <w:w w:val="95"/>
-                                  <w:sz w:val="20"/>
-                                  <w:szCs w:val="20"/>
-                                  <w:lang w:val="es-ES"/>
-                                </w:rPr>
-                                <w:t>FORMATION</w:t>
-                              </w:r>
-                            </w:p>
-                          </w:txbxContent>
-                        </wps:txbx>
-                        <wps:bodyPr rot="0" vert="horz" wrap="square" lIns="91440" tIns="45720" rIns="91440" bIns="45720" anchor="t" anchorCtr="0">
-                          <a:noAutofit/>
-                        </wps:bodyPr>
-                      </wps:wsp>
-                      <wps:wsp>
-                        <wps:cNvPr id="1051546901" name="Connecteur droit 3"/>
-                        <wps:cNvCnPr/>
-                        <wps:spPr>
-                          <a:xfrm>
-                            <a:off x="106878" y="320634"/>
-                            <a:ext cx="4182110" cy="0"/>
-                          </a:xfrm>
-                          <a:prstGeom prst="line">
-                            <a:avLst/>
-                          </a:prstGeom>
-                          <a:ln>
-                            <a:solidFill>
-                              <a:schemeClr val="bg1">
-                                <a:lumMod val="75000"/>
-                              </a:schemeClr>
-                            </a:solidFill>
-                          </a:ln>
-                        </wps:spPr>
-                        <wps:style>
-                          <a:lnRef idx="1">
-                            <a:schemeClr val="accent1"/>
-                          </a:lnRef>
-                          <a:fillRef idx="0">
-                            <a:schemeClr val="accent1"/>
-                          </a:fillRef>
-                          <a:effectRef idx="0">
-                            <a:schemeClr val="accent1"/>
-                          </a:effectRef>
-                          <a:fontRef idx="minor">
-                            <a:schemeClr val="tx1"/>
-                          </a:fontRef>
-                        </wps:style>
-                        <wps:bodyPr/>
-                      </wps:wsp>
-                      <wps:wsp>
-                        <wps:cNvPr id="577383387" name="Connecteur droit 3"/>
-                        <wps:cNvCnPr/>
-                        <wps:spPr>
-                          <a:xfrm>
-                            <a:off x="106878" y="47501"/>
-                            <a:ext cx="4182110" cy="0"/>
-                          </a:xfrm>
-                          <a:prstGeom prst="line">
-                            <a:avLst/>
-                          </a:prstGeom>
-                          <a:ln>
-                            <a:solidFill>
-                              <a:schemeClr val="bg1">
-                                <a:lumMod val="75000"/>
-                              </a:schemeClr>
-                            </a:solidFill>
-                          </a:ln>
-                        </wps:spPr>
-                        <wps:style>
-                          <a:lnRef idx="1">
-                            <a:schemeClr val="accent1"/>
-                          </a:lnRef>
-                          <a:fillRef idx="0">
-                            <a:schemeClr val="accent1"/>
-                          </a:fillRef>
-                          <a:effectRef idx="0">
-                            <a:schemeClr val="accent1"/>
-                          </a:effectRef>
-                          <a:fontRef idx="minor">
-                            <a:schemeClr val="tx1"/>
-                          </a:fontRef>
-                        </wps:style>
-                        <wps:bodyPr/>
-                      </wps:wsp>
-                      <wps:wsp>
-                        <wps:cNvPr id="392886903" name="Zone de texte 2"/>
-                        <wps:cNvSpPr txBox="1">
-                          <a:spLocks noChangeArrowheads="1"/>
-                        </wps:cNvSpPr>
-                        <wps:spPr bwMode="auto">
-                          <a:xfrm>
-                            <a:off x="11875" y="312746"/>
-                            <a:ext cx="4019550" cy="313690"/>
-                          </a:xfrm>
-                          <a:prstGeom prst="rect">
-                            <a:avLst/>
-                          </a:prstGeom>
-                          <a:noFill/>
-                          <a:ln w="9525">
-                            <a:noFill/>
-                            <a:miter lim="800000"/>
-                            <a:headEnd/>
-                            <a:tailEnd/>
-                          </a:ln>
-                        </wps:spPr>
-                        <wps:txbx>
-                          <w:txbxContent>
-                            <w:p>
-                              <w:pPr>
-                                <w:pStyle w:val="Corpsdetexte"/>
-                                <w:spacing w:before="101"/>
-                                <w:ind w:right="98"/>
-                                <w:rPr>
-                                  <w:color w:val="262626" w:themeColor="text1" w:themeTint="D9"/>
-                                  <w:sz w:val="20"/>
-                                  <w:szCs w:val="20"/>
-                                  <w:lang w:val="es-ES"/>
-                                </w:rPr>
-                              </w:pPr>
-                              <w:proofErr w:type="spellStart"/>
-                              <w:r>
-                                <w:rPr>
-                                  <w:b/>
-                                  <w:color w:val="2F2F2F"/>
-                                  <w:position w:val="4"/>
-                                  <w:sz w:val="20"/>
-                                  <w:szCs w:val="20"/>
-                                  <w:lang w:val="es-ES"/>
-                                </w:rPr>
-                                <w:t>Licence</w:t>
-                              </w:r>
-                              <w:proofErr w:type="spellEnd"/>
-                              <w:r>
-                                <w:rPr>
-                                  <w:b/>
-                                  <w:color w:val="2F2F2F"/>
-                                  <w:position w:val="4"/>
-                                  <w:sz w:val="20"/>
-                                  <w:szCs w:val="20"/>
-                                  <w:lang w:val="es-ES"/>
-                                </w:rPr>
-                                <w:t xml:space="preserve"> 2 | </w:t>
-                              </w:r>
-                              <w:proofErr w:type="spellStart"/>
-                              <w:r>
-                                <w:rPr>
-                                  <w:b/>
-                                  <w:color w:val="2F2F2F"/>
-                                  <w:position w:val="4"/>
-                                  <w:sz w:val="20"/>
-                                  <w:szCs w:val="20"/>
-                                  <w:lang w:val="es-ES"/>
-                                </w:rPr>
-                                <w:t>Economie</w:t>
-                              </w:r>
-                              <w:proofErr w:type="spellEnd"/>
-                              <w:r>
-                                <w:rPr>
-                                  <w:b/>
-                                  <w:color w:val="2F2F2F"/>
-                                  <w:position w:val="4"/>
-                                  <w:sz w:val="20"/>
-                                  <w:szCs w:val="20"/>
-                                  <w:lang w:val="es-ES"/>
-                                </w:rPr>
-                                <w:t xml:space="preserve"> Et D</w:t>
-                              </w:r>
-                              <w:r>
-                                <w:rPr>
-                                  <w:b/>
-                                  <w:color w:val="2F2F2F"/>
-                                  <w:position w:val="4"/>
-                                  <w:sz w:val="20"/>
-                                  <w:szCs w:val="20"/>
-                                  <w:lang w:val="es-ES"/>
-                                </w:rPr>
-                                <w:t>é</w:t>
-                              </w:r>
-                              <w:r>
-                                <w:rPr>
-                                  <w:b/>
-                                  <w:color w:val="2F2F2F"/>
-                                  <w:position w:val="4"/>
-                                  <w:sz w:val="20"/>
-                                  <w:szCs w:val="20"/>
-                                  <w:lang w:val="es-ES"/>
-                                </w:rPr>
-                                <w:t>veloppement</w:t>
-                              </w:r>
-                            </w:p>
-                          </w:txbxContent>
-                        </wps:txbx>
-                        <wps:bodyPr rot="0" vert="horz" wrap="square" lIns="91440" tIns="45720" rIns="91440" bIns="45720" anchor="t" anchorCtr="0">
-                          <a:noAutofit/>
-                        </wps:bodyPr>
-                      </wps:wsp>
-                      <wps:wsp>
-                        <wps:cNvPr id="1310104125" name="Zone de texte 2"/>
-                        <wps:cNvSpPr txBox="1">
-                          <a:spLocks noChangeArrowheads="1"/>
-                        </wps:cNvSpPr>
-                        <wps:spPr bwMode="auto">
-                          <a:xfrm>
-                            <a:off x="0" y="526502"/>
-                            <a:ext cx="1992630" cy="260986"/>
-                          </a:xfrm>
-                          <a:prstGeom prst="rect">
-                            <a:avLst/>
-                          </a:prstGeom>
-                          <a:noFill/>
-                          <a:ln w="9525">
-                            <a:noFill/>
-                            <a:miter lim="800000"/>
-                            <a:headEnd/>
-                            <a:tailEnd/>
-                          </a:ln>
-                        </wps:spPr>
-                        <wps:txbx>
-                          <w:txbxContent>
-                            <w:p>
-                              <w:pPr>
-                                <w:rPr>
-                                  <w:color w:val="2F2F2F"/>
-                                  <w:sz w:val="20"/>
-                                  <w:szCs w:val="20"/>
-                                </w:rPr>
-                              </w:pPr>
-                              <w:proofErr w:type="spellStart"/>
-                              <w:r>
-                                <w:rPr>
-                                  <w:color w:val="2F2F2F"/>
-                                  <w:sz w:val="20"/>
-                                  <w:szCs w:val="20"/>
-                                  <w:lang w:val="es-ES"/>
-                                </w:rPr>
-                                <w:t>Université</w:t>
-                              </w:r>
-                              <w:proofErr w:type="spellEnd"/>
-                              <w:r>
-                                <w:rPr>
-                                  <w:color w:val="2F2F2F"/>
-                                  <w:sz w:val="20"/>
-                                  <w:szCs w:val="20"/>
-                                  <w:lang w:val="es-ES"/>
-                                </w:rPr>
-                                <w:t xml:space="preserve"> </w:t>
-                              </w:r>
-                              <w:proofErr w:type="spellStart"/>
-                              <w:r>
-                                <w:rPr>
-                                  <w:color w:val="2F2F2F"/>
-                                  <w:sz w:val="20"/>
-                                  <w:szCs w:val="20"/>
-                                  <w:lang w:val="es-ES"/>
-                                </w:rPr>
-                                <w:t>Catholique</w:t>
-                              </w:r>
-                              <w:proofErr w:type="spellEnd"/>
-                              <w:r>
-                                <w:rPr>
-                                  <w:color w:val="2F2F2F"/>
-                                  <w:sz w:val="20"/>
-                                  <w:szCs w:val="20"/>
-                                  <w:lang w:val="es-ES"/>
-                                </w:rPr>
-                                <w:t xml:space="preserve"> du Congo</w:t>
-                              </w:r>
-                            </w:p>
-                          </w:txbxContent>
-                        </wps:txbx>
-                        <wps:bodyPr rot="0" vert="horz" wrap="square" lIns="91440" tIns="45720" rIns="91440" bIns="45720" anchor="t" anchorCtr="0">
-                          <a:noAutofit/>
-                        </wps:bodyPr>
-                      </wps:wsp>
-                      <wps:wsp>
-                        <wps:cNvPr id="2036783882" name="Zone de texte 2"/>
-                        <wps:cNvSpPr txBox="1">
-                          <a:spLocks noChangeArrowheads="1"/>
-                        </wps:cNvSpPr>
-                        <wps:spPr bwMode="auto">
-                          <a:xfrm>
-                            <a:off x="2683823" y="383998"/>
-                            <a:ext cx="1705610" cy="260986"/>
-                          </a:xfrm>
-                          <a:prstGeom prst="rect">
-                            <a:avLst/>
-                          </a:prstGeom>
-                          <a:noFill/>
-                          <a:ln w="9525">
-                            <a:noFill/>
-                            <a:miter lim="800000"/>
-                            <a:headEnd/>
-                            <a:tailEnd/>
-                          </a:ln>
-                        </wps:spPr>
-                        <wps:txbx>
-                          <w:txbxContent>
-                            <w:p>
-                              <w:pPr>
-                                <w:jc w:val="right"/>
-                                <w:rPr>
-                                  <w:color w:val="2F2F2F"/>
-                                  <w:sz w:val="20"/>
-                                  <w:szCs w:val="20"/>
-                                  <w:lang w:val="fr-FR"/>
-                                </w:rPr>
-                              </w:pPr>
-                              <w:r>
-                                <w:rPr>
-                                  <w:color w:val="2F2F2F"/>
-                                  <w:position w:val="-4"/>
-                                  <w:sz w:val="20"/>
-                                  <w:szCs w:val="20"/>
-                                  <w:lang w:val="fr-FR"/>
-                                </w:rPr>
-                                <w:t>2026 En cours</w:t>
-                              </w:r>
-                            </w:p>
-                          </w:txbxContent>
-                        </wps:txbx>
-                        <wps:bodyPr rot="0" vert="horz" wrap="square" lIns="91440" tIns="45720" rIns="91440" bIns="45720" anchor="t" anchorCtr="0">
-                          <a:noAutofit/>
-                        </wps:bodyPr>
-                      </wps:wsp>
-                      <wps:wsp>
-                        <wps:cNvPr id="1673552926" name="Zone de texte 2"/>
-                        <wps:cNvSpPr txBox="1">
-                          <a:spLocks noChangeArrowheads="1"/>
-                        </wps:cNvSpPr>
-                        <wps:spPr bwMode="auto">
-                          <a:xfrm>
-                            <a:off x="11875" y="788976"/>
-                            <a:ext cx="4019550" cy="313690"/>
-                          </a:xfrm>
-                          <a:prstGeom prst="rect">
-                            <a:avLst/>
-                          </a:prstGeom>
-                          <a:noFill/>
-                          <a:ln w="9525">
-                            <a:noFill/>
-                            <a:miter lim="800000"/>
-                            <a:headEnd/>
-                            <a:tailEnd/>
-                          </a:ln>
-                        </wps:spPr>
-                        <wps:txbx>
-                          <w:txbxContent>
-                            <w:p>
-                              <w:pPr>
-                                <w:pStyle w:val="Corpsdetexte"/>
-                                <w:spacing w:before="101"/>
-                                <w:ind w:right="98"/>
-                                <w:rPr>
-                                  <w:color w:val="262626" w:themeColor="text1" w:themeTint="D9"/>
-                                  <w:sz w:val="20"/>
-                                  <w:szCs w:val="20"/>
-                                  <w:lang w:val="es-ES"/>
-                                </w:rPr>
-                              </w:pPr>
-                              <w:proofErr w:type="spellStart"/>
-                              <w:r>
-                                <w:rPr>
-                                  <w:b/>
-                                  <w:color w:val="2F2F2F"/>
-                                  <w:position w:val="4"/>
-                                  <w:sz w:val="20"/>
-                                  <w:szCs w:val="20"/>
-                                  <w:lang w:val="es-ES"/>
-                                </w:rPr>
-                                <w:t>Diplôme</w:t>
-                              </w:r>
-                              <w:proofErr w:type="spellEnd"/>
-                              <w:r>
-                                <w:rPr>
-                                  <w:b/>
-                                  <w:color w:val="2F2F2F"/>
-                                  <w:position w:val="4"/>
-                                  <w:sz w:val="20"/>
-                                  <w:szCs w:val="20"/>
-                                  <w:lang w:val="es-ES"/>
-                                </w:rPr>
-                                <w:t xml:space="preserve"> </w:t>
-                              </w:r>
-                              <w:proofErr w:type="spellStart"/>
-                              <w:r>
-                                <w:rPr>
-                                  <w:b/>
-                                  <w:color w:val="2F2F2F"/>
-                                  <w:position w:val="4"/>
-                                  <w:sz w:val="20"/>
-                                  <w:szCs w:val="20"/>
-                                  <w:lang w:val="es-ES"/>
-                                </w:rPr>
-                                <w:t>d’Etat</w:t>
-                              </w:r>
-                              <w:proofErr w:type="spellEnd"/>
-                              <w:r>
-                                <w:rPr>
-                                  <w:b/>
-                                  <w:color w:val="2F2F2F"/>
-                                  <w:position w:val="4"/>
-                                  <w:sz w:val="20"/>
-                                  <w:szCs w:val="20"/>
-                                  <w:lang w:val="es-ES"/>
-                                </w:rPr>
-                                <w:t xml:space="preserve"> | </w:t>
-                              </w:r>
-                              <w:proofErr w:type="spellStart"/>
-                              <w:r>
-                                <w:rPr>
-                                  <w:b/>
-                                  <w:color w:val="2F2F2F"/>
-                                  <w:position w:val="4"/>
-                                  <w:sz w:val="20"/>
-                                  <w:szCs w:val="20"/>
-                                  <w:lang w:val="es-ES"/>
-                                </w:rPr>
-                                <w:t>Commerciale</w:t>
-                              </w:r>
-                              <w:proofErr w:type="spellEnd"/>
-                              <w:r>
-                                <w:rPr>
-                                  <w:b/>
-                                  <w:color w:val="2F2F2F"/>
-                                  <w:position w:val="4"/>
-                                  <w:sz w:val="20"/>
-                                  <w:szCs w:val="20"/>
-                                  <w:lang w:val="es-ES"/>
-                                </w:rPr>
-                                <w:t xml:space="preserve"> et </w:t>
-                              </w:r>
-                              <w:proofErr w:type="spellStart"/>
-                              <w:r>
-                                <w:rPr>
-                                  <w:b/>
-                                  <w:color w:val="2F2F2F"/>
-                                  <w:position w:val="4"/>
-                                  <w:sz w:val="20"/>
-                                  <w:szCs w:val="20"/>
-                                  <w:lang w:val="es-ES"/>
-                                </w:rPr>
-                                <w:t>Gestion</w:t>
-                              </w:r>
-                              <w:proofErr w:type="spellEnd"/>
-                            </w:p>
-                          </w:txbxContent>
-                        </wps:txbx>
-                        <wps:bodyPr rot="0" vert="horz" wrap="square" lIns="91440" tIns="45720" rIns="91440" bIns="45720" anchor="t" anchorCtr="0">
-                          <a:noAutofit/>
-                        </wps:bodyPr>
-                      </wps:wsp>
-                      <wps:wsp>
-                        <wps:cNvPr id="996651291" name="Zone de texte 2"/>
-                        <wps:cNvSpPr txBox="1">
-                          <a:spLocks noChangeArrowheads="1"/>
-                        </wps:cNvSpPr>
-                        <wps:spPr bwMode="auto">
-                          <a:xfrm>
-                            <a:off x="0" y="1014606"/>
-                            <a:ext cx="1705610" cy="260986"/>
-                          </a:xfrm>
-                          <a:prstGeom prst="rect">
-                            <a:avLst/>
-                          </a:prstGeom>
-                          <a:noFill/>
-                          <a:ln w="9525">
-                            <a:noFill/>
-                            <a:miter lim="800000"/>
-                            <a:headEnd/>
-                            <a:tailEnd/>
-                          </a:ln>
-                        </wps:spPr>
-                        <wps:txbx>
-                          <w:txbxContent>
-                            <w:p>
-                              <w:pPr>
-                                <w:rPr>
-                                  <w:color w:val="2F2F2F"/>
-                                  <w:sz w:val="20"/>
-                                  <w:szCs w:val="20"/>
-                                  <w:lang w:val="es-ES"/>
-                                </w:rPr>
-                              </w:pPr>
-                              <w:proofErr w:type="spellStart"/>
-                              <w:r>
-                                <w:rPr>
-                                  <w:color w:val="2F2F2F"/>
-                                  <w:sz w:val="20"/>
-                                  <w:szCs w:val="20"/>
-                                  <w:lang w:val="es-ES"/>
-                                </w:rPr>
-                                <w:t>Révérend</w:t>
-                              </w:r>
-                              <w:proofErr w:type="spellEnd"/>
-                              <w:r>
-                                <w:rPr>
-                                  <w:color w:val="2F2F2F"/>
-                                  <w:sz w:val="20"/>
-                                  <w:szCs w:val="20"/>
-                                  <w:lang w:val="es-ES"/>
-                                </w:rPr>
-                                <w:t xml:space="preserve"> Kim</w:t>
-                              </w:r>
-                            </w:p>
-                          </w:txbxContent>
-                        </wps:txbx>
-                        <wps:bodyPr rot="0" vert="horz" wrap="square" lIns="91440" tIns="45720" rIns="91440" bIns="45720" anchor="t" anchorCtr="0">
-                          <a:noAutofit/>
-                        </wps:bodyPr>
-                      </wps:wsp>
-                      <wps:wsp>
-                        <wps:cNvPr id="1326918901" name="Zone de texte 2"/>
-                        <wps:cNvSpPr txBox="1">
-                          <a:spLocks noChangeArrowheads="1"/>
-                        </wps:cNvSpPr>
-                        <wps:spPr bwMode="auto">
-                          <a:xfrm>
-                            <a:off x="2458192" y="860227"/>
-                            <a:ext cx="1929765" cy="260986"/>
-                          </a:xfrm>
-                          <a:prstGeom prst="rect">
-                            <a:avLst/>
-                          </a:prstGeom>
-                          <a:noFill/>
-                          <a:ln w="9525">
-                            <a:noFill/>
-                            <a:miter lim="800000"/>
-                            <a:headEnd/>
-                            <a:tailEnd/>
-                          </a:ln>
-                        </wps:spPr>
-                        <wps:txbx>
-                          <w:txbxContent>
-                            <w:p>
-                              <w:pPr>
-                                <w:jc w:val="right"/>
-                                <w:rPr>
-                                  <w:color w:val="2F2F2F"/>
-                                  <w:sz w:val="20"/>
-                                  <w:szCs w:val="20"/>
-                                  <w:lang w:val="fr-FR"/>
-                                </w:rPr>
-                              </w:pPr>
-                              <w:proofErr w:type="spellStart"/>
-                              <w:r>
-                                <w:rPr>
-                                  <w:color w:val="2F2F2F"/>
-                                  <w:position w:val="-4"/>
-                                  <w:sz w:val="20"/>
-                                  <w:szCs w:val="20"/>
-                                </w:rPr>
-                                <w:t>Septembre</w:t>
-                              </w:r>
-                              <w:proofErr w:type="spellEnd"/>
-                              <w:r>
-                                <w:rPr>
-                                  <w:color w:val="2F2F2F"/>
-                                  <w:spacing w:val="6"/>
-                                  <w:position w:val="-4"/>
-                                  <w:sz w:val="20"/>
-                                  <w:szCs w:val="20"/>
-                                </w:rPr>
-                                <w:t xml:space="preserve"> </w:t>
-                              </w:r>
-                              <w:r>
-                                <w:rPr>
-                                  <w:color w:val="2F2F2F"/>
-                                  <w:position w:val="-4"/>
-                                  <w:sz w:val="20"/>
-                                  <w:szCs w:val="20"/>
-                                </w:rPr>
-                                <w:t>20</w:t>
-                              </w:r>
-                              <w:r>
-                                <w:rPr>
-                                  <w:color w:val="2F2F2F"/>
-                                  <w:position w:val="-4"/>
-                                  <w:sz w:val="20"/>
-                                  <w:szCs w:val="20"/>
-                                </w:rPr>
-                                <w:t>22</w:t>
-                              </w:r>
-                              <w:r>
-                                <w:rPr>
-                                  <w:color w:val="2F2F2F"/>
-                                  <w:spacing w:val="27"/>
-                                  <w:position w:val="-4"/>
-                                  <w:sz w:val="20"/>
-                                  <w:szCs w:val="20"/>
-                                </w:rPr>
-                                <w:t xml:space="preserve"> </w:t>
-                              </w:r>
-                              <w:r>
-                                <w:rPr>
-                                  <w:color w:val="2F2F2F"/>
-                                  <w:position w:val="-4"/>
-                                  <w:sz w:val="20"/>
-                                  <w:szCs w:val="20"/>
-                                </w:rPr>
-                                <w:t>—</w:t>
-                              </w:r>
-                              <w:r>
-                                <w:rPr>
-                                  <w:color w:val="2F2F2F"/>
-                                  <w:spacing w:val="28"/>
-                                  <w:position w:val="-4"/>
-                                  <w:sz w:val="20"/>
-                                  <w:szCs w:val="20"/>
-                                </w:rPr>
-                                <w:t xml:space="preserve"> </w:t>
-                              </w:r>
-                              <w:r>
-                                <w:rPr>
-                                  <w:color w:val="2F2F2F"/>
-                                  <w:position w:val="-4"/>
-                                  <w:sz w:val="20"/>
-                                  <w:szCs w:val="20"/>
-                                </w:rPr>
-                                <w:t>Juin</w:t>
-                              </w:r>
-                              <w:r>
-                                <w:rPr>
-                                  <w:color w:val="2F2F2F"/>
-                                  <w:spacing w:val="6"/>
-                                  <w:position w:val="-4"/>
-                                  <w:sz w:val="20"/>
-                                  <w:szCs w:val="20"/>
-                                </w:rPr>
-                                <w:t xml:space="preserve"> </w:t>
-                              </w:r>
-                              <w:r>
-                                <w:rPr>
-                                  <w:color w:val="2F2F2F"/>
-                                  <w:position w:val="-4"/>
-                                  <w:sz w:val="20"/>
-                                  <w:szCs w:val="20"/>
-                                </w:rPr>
-                                <w:t>20</w:t>
-                              </w:r>
-                              <w:r>
-                                <w:rPr>
-                                  <w:color w:val="2F2F2F"/>
-                                  <w:position w:val="-4"/>
-                                  <w:sz w:val="20"/>
-                                  <w:szCs w:val="20"/>
-                                </w:rPr>
-                                <w:t>23</w:t>
-                              </w:r>
-                            </w:p>
-                          </w:txbxContent>
-                        </wps:txbx>
-                        <wps:bodyPr rot="0" vert="horz" wrap="square" lIns="91440" tIns="45720" rIns="91440" bIns="45720" anchor="t" anchorCtr="0">
-                          <a:noAutofit/>
-                        </wps:bodyPr>
-                      </wps:wsp>
-                    </wpg:wgp>
-                  </a:graphicData>
-                </a:graphic>
-                <wp14:sizeRelV relativeFrom="margin">
-                  <wp14:pctHeight>0</wp14:pctHeight>
-                </wp14:sizeRelV>
-              </wp:anchor>
-            </w:drawing>
-          </mc:Choice>
-          <mc:Fallback>
-            <w:pict>
-              <v:group w14:anchorId="74FE1078" id="_x0000_s1060" style="position:absolute;margin-left:175.5pt;margin-top:313.15pt;width:345.6pt;height:87.15pt;z-index:251681792;mso-height-relative:margin" coordorigin=",475" coordsize="43894,12280" o:gfxdata="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">
-                <v:shape id="_x0000_s1061" type="#_x0000_t202" style="position:absolute;left:118;top:493;width:23051;height:3098;visibility:visible;mso-wrap-style:square;v-text-anchor:top" o:gfxdata="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" filled="f" stroked="f">
-                  <v:textbox>
-                    <w:txbxContent>
-                      <w:p>
-                        <w:pPr>
-                          <w:pStyle w:val="Corpsdetexte"/>
-                          <w:rPr>
-                            <w:lang w:val="es-ES"/>
-                          </w:rPr>
-                        </w:pPr>
-                        <w:r>
-                          <w:rPr>
-                            <w:w w:val="95"/>
-                            <w:sz w:val="20"/>
-                            <w:szCs w:val="20"/>
-                            <w:lang w:val="es-ES"/>
-                          </w:rPr>
-                          <w:t>FORMATION</w:t>
-                        </w:r>
-                      </w:p>
-                    </w:txbxContent>
-                  </v:textbox>
-                </v:shape>
-                <v:line id="Connecteur droit 3" o:spid="_x0000_s1062" style="position:absolute;visibility:visible;mso-wrap-style:square" from="1068,3206" to="42889,3206" o:connectortype="straight" o:gfxdata="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" strokecolor="#bfbfbf [2412]" strokeweight=".5pt">
-                  <v:stroke joinstyle="miter"/>
-                </v:line>
-                <v:line id="Connecteur droit 3" o:spid="_x0000_s1063" style="position:absolute;visibility:visible;mso-wrap-style:square" from="1068,475" to="42889,475" o:connectortype="straight" o:gfxdata="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" strokecolor="#bfbfbf [2412]" strokeweight=".5pt">
-                  <v:stroke joinstyle="miter"/>
-                </v:line>
-                <v:shape id="_x0000_s1064" type="#_x0000_t202" style="position:absolute;left:118;top:3127;width:40196;height:3137;visibility:visible;mso-wrap-style:square;v-text-anchor:top" o:gfxdata="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" filled="f" stroked="f">
-                  <v:textbox>
-                    <w:txbxContent>
-                      <w:p>
-                        <w:pPr>
-                          <w:pStyle w:val="Corpsdetexte"/>
-                          <w:spacing w:before="101"/>
-                          <w:ind w:right="98"/>
-                          <w:rPr>
-                            <w:color w:val="262626" w:themeColor="text1" w:themeTint="D9"/>
-                            <w:sz w:val="20"/>
-                            <w:szCs w:val="20"/>
-                            <w:lang w:val="es-ES"/>
-                          </w:rPr>
-                        </w:pPr>
-                        <w:proofErr w:type="spellStart"/>
-                        <w:r>
-                          <w:rPr>
-                            <w:b/>
-                            <w:color w:val="2F2F2F"/>
-                            <w:position w:val="4"/>
-                            <w:sz w:val="20"/>
-                            <w:szCs w:val="20"/>
-                            <w:lang w:val="es-ES"/>
-                          </w:rPr>
-                          <w:t>Licence</w:t>
-                        </w:r>
-                        <w:proofErr w:type="spellEnd"/>
-                        <w:r>
-                          <w:rPr>
-                            <w:b/>
-                            <w:color w:val="2F2F2F"/>
-                            <w:position w:val="4"/>
-                            <w:sz w:val="20"/>
-                            <w:szCs w:val="20"/>
-                            <w:lang w:val="es-ES"/>
-                          </w:rPr>
-                          <w:t xml:space="preserve"> 2 | </w:t>
-                        </w:r>
-                        <w:proofErr w:type="spellStart"/>
-                        <w:r>
-                          <w:rPr>
-                            <w:b/>
-                            <w:color w:val="2F2F2F"/>
-                            <w:position w:val="4"/>
-                            <w:sz w:val="20"/>
-                            <w:szCs w:val="20"/>
-                            <w:lang w:val="es-ES"/>
-                          </w:rPr>
-                          <w:t>Economie</w:t>
-                        </w:r>
-                        <w:proofErr w:type="spellEnd"/>
-                        <w:r>
-                          <w:rPr>
-                            <w:b/>
-                            <w:color w:val="2F2F2F"/>
-                            <w:position w:val="4"/>
-                            <w:sz w:val="20"/>
-                            <w:szCs w:val="20"/>
-                            <w:lang w:val="es-ES"/>
-                          </w:rPr>
-                          <w:t xml:space="preserve"> Et D</w:t>
-                        </w:r>
-                        <w:r>
-                          <w:rPr>
-                            <w:b/>
-                            <w:color w:val="2F2F2F"/>
-                            <w:position w:val="4"/>
-                            <w:sz w:val="20"/>
-                            <w:szCs w:val="20"/>
-                            <w:lang w:val="es-ES"/>
-                          </w:rPr>
-                          <w:t>é</w:t>
-                        </w:r>
-                        <w:r>
-                          <w:rPr>
-                            <w:b/>
-                            <w:color w:val="2F2F2F"/>
-                            <w:position w:val="4"/>
-                            <w:sz w:val="20"/>
-                            <w:szCs w:val="20"/>
-                            <w:lang w:val="es-ES"/>
-                          </w:rPr>
-                          <w:t>veloppement</w:t>
-                        </w:r>
-                      </w:p>
-                    </w:txbxContent>
-                  </v:textbox>
-                </v:shape>
-                <v:shape id="_x0000_s1065" type="#_x0000_t202" style="position:absolute;top:5265;width:19926;height:2609;visibility:visible;mso-wrap-style:square;v-text-anchor:top" o:gfxdata="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" filled="f" stroked="f">
-                  <v:textbox>
-                    <w:txbxContent>
-                      <w:p>
-                        <w:pPr>
-                          <w:rPr>
-                            <w:color w:val="2F2F2F"/>
-                            <w:sz w:val="20"/>
-                            <w:szCs w:val="20"/>
-                          </w:rPr>
-                        </w:pPr>
-                        <w:proofErr w:type="spellStart"/>
-                        <w:r>
-                          <w:rPr>
-                            <w:color w:val="2F2F2F"/>
-                            <w:sz w:val="20"/>
-                            <w:szCs w:val="20"/>
-                            <w:lang w:val="es-ES"/>
-                          </w:rPr>
-                          <w:t>Université</w:t>
-                        </w:r>
-                        <w:proofErr w:type="spellEnd"/>
-                        <w:r>
-                          <w:rPr>
-                            <w:color w:val="2F2F2F"/>
-                            <w:sz w:val="20"/>
-                            <w:szCs w:val="20"/>
-                            <w:lang w:val="es-ES"/>
-                          </w:rPr>
-                          <w:t xml:space="preserve"> </w:t>
-                        </w:r>
-                        <w:proofErr w:type="spellStart"/>
-                        <w:r>
-                          <w:rPr>
-                            <w:color w:val="2F2F2F"/>
-                            <w:sz w:val="20"/>
-                            <w:szCs w:val="20"/>
-                            <w:lang w:val="es-ES"/>
-                          </w:rPr>
-                          <w:t>Catholique</w:t>
-                        </w:r>
-                        <w:proofErr w:type="spellEnd"/>
-                        <w:r>
-                          <w:rPr>
-                            <w:color w:val="2F2F2F"/>
-                            <w:sz w:val="20"/>
-                            <w:szCs w:val="20"/>
-                            <w:lang w:val="es-ES"/>
-                          </w:rPr>
-                          <w:t xml:space="preserve"> du Congo</w:t>
-                        </w:r>
-                      </w:p>
-                    </w:txbxContent>
-                  </v:textbox>
-                </v:shape>
-                <v:shape id="_x0000_s1066" type="#_x0000_t202" style="position:absolute;left:26838;top:3839;width:17056;height:2610;visibility:visible;mso-wrap-style:square;v-text-anchor:top" o:gfxdata="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" filled="f" stroked="f">
-                  <v:textbox>
-                    <w:txbxContent>
-                      <w:p>
-                        <w:pPr>
-                          <w:jc w:val="right"/>
-                          <w:rPr>
-                            <w:color w:val="2F2F2F"/>
-                            <w:sz w:val="20"/>
-                            <w:szCs w:val="20"/>
-                            <w:lang w:val="fr-FR"/>
-                          </w:rPr>
-                        </w:pPr>
-                        <w:r>
-                          <w:rPr>
-                            <w:color w:val="2F2F2F"/>
-                            <w:position w:val="-4"/>
-                            <w:sz w:val="20"/>
-                            <w:szCs w:val="20"/>
-                            <w:lang w:val="fr-FR"/>
-                          </w:rPr>
-                          <w:t>2026 En cours</w:t>
-                        </w:r>
-                      </w:p>
-                    </w:txbxContent>
-                  </v:textbox>
-                </v:shape>
-                <v:shape id="_x0000_s1067" type="#_x0000_t202" style="position:absolute;left:118;top:7889;width:40196;height:3137;visibility:visible;mso-wrap-style:square;v-text-anchor:top" o:gfxdata="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" filled="f" stroked="f">
-                  <v:textbox>
-                    <w:txbxContent>
-                      <w:p>
-                        <w:pPr>
-                          <w:pStyle w:val="Corpsdetexte"/>
-                          <w:spacing w:before="101"/>
-                          <w:ind w:right="98"/>
-                          <w:rPr>
-                            <w:color w:val="262626" w:themeColor="text1" w:themeTint="D9"/>
-                            <w:sz w:val="20"/>
-                            <w:szCs w:val="20"/>
-                            <w:lang w:val="es-ES"/>
-                          </w:rPr>
-                        </w:pPr>
-                        <w:proofErr w:type="spellStart"/>
-                        <w:r>
-                          <w:rPr>
-                            <w:b/>
-                            <w:color w:val="2F2F2F"/>
-                            <w:position w:val="4"/>
-                            <w:sz w:val="20"/>
-                            <w:szCs w:val="20"/>
-                            <w:lang w:val="es-ES"/>
-                          </w:rPr>
-                          <w:t>Diplôme</w:t>
-                        </w:r>
-                        <w:proofErr w:type="spellEnd"/>
-                        <w:r>
-                          <w:rPr>
-                            <w:b/>
-                            <w:color w:val="2F2F2F"/>
-                            <w:position w:val="4"/>
-                            <w:sz w:val="20"/>
-                            <w:szCs w:val="20"/>
-                            <w:lang w:val="es-ES"/>
-                          </w:rPr>
-                          <w:t xml:space="preserve"> </w:t>
-                        </w:r>
-                        <w:proofErr w:type="spellStart"/>
-                        <w:r>
-                          <w:rPr>
-                            <w:b/>
-                            <w:color w:val="2F2F2F"/>
-                            <w:position w:val="4"/>
-                            <w:sz w:val="20"/>
-                            <w:szCs w:val="20"/>
-                            <w:lang w:val="es-ES"/>
-                          </w:rPr>
-                          <w:t>d’Etat</w:t>
-                        </w:r>
-                        <w:proofErr w:type="spellEnd"/>
-                        <w:r>
-                          <w:rPr>
-                            <w:b/>
-                            <w:color w:val="2F2F2F"/>
-                            <w:position w:val="4"/>
-                            <w:sz w:val="20"/>
-                            <w:szCs w:val="20"/>
-                            <w:lang w:val="es-ES"/>
-                          </w:rPr>
-                          <w:t xml:space="preserve"> | </w:t>
-                        </w:r>
-                        <w:proofErr w:type="spellStart"/>
-                        <w:r>
-                          <w:rPr>
-                            <w:b/>
-                            <w:color w:val="2F2F2F"/>
-                            <w:position w:val="4"/>
-                            <w:sz w:val="20"/>
-                            <w:szCs w:val="20"/>
-                            <w:lang w:val="es-ES"/>
-                          </w:rPr>
-                          <w:t>Commerciale</w:t>
-                        </w:r>
-                        <w:proofErr w:type="spellEnd"/>
-                        <w:r>
-                          <w:rPr>
-                            <w:b/>
-                            <w:color w:val="2F2F2F"/>
-                            <w:position w:val="4"/>
-                            <w:sz w:val="20"/>
-                            <w:szCs w:val="20"/>
-                            <w:lang w:val="es-ES"/>
-                          </w:rPr>
-                          <w:t xml:space="preserve"> et </w:t>
-                        </w:r>
-                        <w:proofErr w:type="spellStart"/>
-                        <w:r>
-                          <w:rPr>
-                            <w:b/>
-                            <w:color w:val="2F2F2F"/>
-                            <w:position w:val="4"/>
-                            <w:sz w:val="20"/>
-                            <w:szCs w:val="20"/>
-                            <w:lang w:val="es-ES"/>
-                          </w:rPr>
-                          <w:t>Gestion</w:t>
-                        </w:r>
-                        <w:proofErr w:type="spellEnd"/>
-                      </w:p>
-                    </w:txbxContent>
-                  </v:textbox>
-                </v:shape>
-                <v:shape id="_x0000_s1068" type="#_x0000_t202" style="position:absolute;top:10146;width:17056;height:2609;visibility:visible;mso-wrap-style:square;v-text-anchor:top" o:gfxdata="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" filled="f" stroked="f">
-                  <v:textbox>
-                    <w:txbxContent>
-                      <w:p>
-                        <w:pPr>
-                          <w:rPr>
-                            <w:color w:val="2F2F2F"/>
-                            <w:sz w:val="20"/>
-                            <w:szCs w:val="20"/>
-                            <w:lang w:val="es-ES"/>
-                          </w:rPr>
-                        </w:pPr>
-                        <w:proofErr w:type="spellStart"/>
-                        <w:r>
-                          <w:rPr>
-                            <w:color w:val="2F2F2F"/>
-                            <w:sz w:val="20"/>
-                            <w:szCs w:val="20"/>
-                            <w:lang w:val="es-ES"/>
-                          </w:rPr>
-                          <w:t>Révérend</w:t>
-                        </w:r>
-                        <w:proofErr w:type="spellEnd"/>
-                        <w:r>
-                          <w:rPr>
-                            <w:color w:val="2F2F2F"/>
-                            <w:sz w:val="20"/>
-                            <w:szCs w:val="20"/>
-                            <w:lang w:val="es-ES"/>
-                          </w:rPr>
-                          <w:t xml:space="preserve"> Kim</w:t>
-                        </w:r>
-                      </w:p>
-                    </w:txbxContent>
-                  </v:textbox>
-                </v:shape>
-                <v:shape id="_x0000_s1069" type="#_x0000_t202" style="position:absolute;left:24581;top:8602;width:19298;height:2610;visibility:visible;mso-wrap-style:square;v-text-anchor:top" o:gfxdata="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" filled="f" stroked="f">
-                  <v:textbox>
-                    <w:txbxContent>
-                      <w:p>
-                        <w:pPr>
-                          <w:jc w:val="right"/>
-                          <w:rPr>
-                            <w:color w:val="2F2F2F"/>
-                            <w:sz w:val="20"/>
-                            <w:szCs w:val="20"/>
-                            <w:lang w:val="fr-FR"/>
-                          </w:rPr>
-                        </w:pPr>
-                        <w:proofErr w:type="spellStart"/>
-                        <w:r>
-                          <w:rPr>
-                            <w:color w:val="2F2F2F"/>
-                            <w:position w:val="-4"/>
-                            <w:sz w:val="20"/>
-                            <w:szCs w:val="20"/>
-                          </w:rPr>
-                          <w:t>Septembre</w:t>
-                        </w:r>
-                        <w:proofErr w:type="spellEnd"/>
-                        <w:r>
-                          <w:rPr>
-                            <w:color w:val="2F2F2F"/>
-                            <w:spacing w:val="6"/>
-                            <w:position w:val="-4"/>
-                            <w:sz w:val="20"/>
-                            <w:szCs w:val="20"/>
-                          </w:rPr>
-                          <w:t xml:space="preserve"> </w:t>
-                        </w:r>
-                        <w:r>
-                          <w:rPr>
-                            <w:color w:val="2F2F2F"/>
-                            <w:position w:val="-4"/>
-                            <w:sz w:val="20"/>
-                            <w:szCs w:val="20"/>
-                          </w:rPr>
-                          <w:t>20</w:t>
-                        </w:r>
-                        <w:r>
-                          <w:rPr>
-                            <w:color w:val="2F2F2F"/>
-                            <w:position w:val="-4"/>
-                            <w:sz w:val="20"/>
-                            <w:szCs w:val="20"/>
-                          </w:rPr>
-                          <w:t>22</w:t>
-                        </w:r>
-                        <w:r>
-                          <w:rPr>
-                            <w:color w:val="2F2F2F"/>
-                            <w:spacing w:val="27"/>
-                            <w:position w:val="-4"/>
-                            <w:sz w:val="20"/>
-                            <w:szCs w:val="20"/>
-                          </w:rPr>
-                          <w:t xml:space="preserve"> </w:t>
-                        </w:r>
-                        <w:r>
-                          <w:rPr>
-                            <w:color w:val="2F2F2F"/>
-                            <w:position w:val="-4"/>
-                            <w:sz w:val="20"/>
-                            <w:szCs w:val="20"/>
-                          </w:rPr>
-                          <w:t>—</w:t>
-                        </w:r>
-                        <w:r>
-                          <w:rPr>
-                            <w:color w:val="2F2F2F"/>
-                            <w:spacing w:val="28"/>
-                            <w:position w:val="-4"/>
-                            <w:sz w:val="20"/>
-                            <w:szCs w:val="20"/>
-                          </w:rPr>
-                          <w:t xml:space="preserve"> </w:t>
-                        </w:r>
-                        <w:r>
-                          <w:rPr>
-                            <w:color w:val="2F2F2F"/>
-                            <w:position w:val="-4"/>
-                            <w:sz w:val="20"/>
-                            <w:szCs w:val="20"/>
-                          </w:rPr>
-                          <w:t>Juin</w:t>
-                        </w:r>
-                        <w:r>
-                          <w:rPr>
-                            <w:color w:val="2F2F2F"/>
-                            <w:spacing w:val="6"/>
-                            <w:position w:val="-4"/>
-                            <w:sz w:val="20"/>
-                            <w:szCs w:val="20"/>
-                          </w:rPr>
-                          <w:t xml:space="preserve"> </w:t>
-                        </w:r>
-                        <w:r>
-                          <w:rPr>
-                            <w:color w:val="2F2F2F"/>
-                            <w:position w:val="-4"/>
-                            <w:sz w:val="20"/>
-                            <w:szCs w:val="20"/>
-                          </w:rPr>
-                          <w:t>20</w:t>
-                        </w:r>
-                        <w:r>
-                          <w:rPr>
-                            <w:color w:val="2F2F2F"/>
-                            <w:position w:val="-4"/>
-                            <w:sz w:val="20"/>
-                            <w:szCs w:val="20"/>
-                          </w:rPr>
-                          <w:t>23</w:t>
                         </w:r>
                       </w:p>
                     </w:txbxContent>
@@ -6840,17 +6798,7 @@
                                   <w:szCs w:val="20"/>
                                   <w:lang w:val="fr-FR"/>
                                 </w:rPr>
-                                <w:t>Avril</w:t>
-                              </w:r>
-                              <w:r>
-                                <w:rPr>
-                                  <w:color w:val="2F2F2F"/>
-                                  <w:position w:val="-4"/>
-                                  <w:sz w:val="20"/>
-                                  <w:szCs w:val="20"/>
-                                  <w:lang w:val="fr-FR"/>
-                                </w:rPr>
-                                <w:t xml:space="preserve"> 2026</w:t>
+                                <w:t>Avril 2026</w:t>
                               </w:r>
                             </w:p>
                           </w:txbxContent>
@@ -7104,17 +7052,7 @@
                             <w:szCs w:val="20"/>
                             <w:lang w:val="fr-FR"/>
                           </w:rPr>
-                          <w:t>Avril</w:t>
-                        </w:r>
-                        <w:r>
-                          <w:rPr>
-                            <w:color w:val="2F2F2F"/>
-                            <w:position w:val="-4"/>
-                            <w:sz w:val="20"/>
-                            <w:szCs w:val="20"/>
-                            <w:lang w:val="fr-FR"/>
-                          </w:rPr>
-                          <w:t xml:space="preserve"> 2026</w:t>
+                          <w:t>Avril 2026</w:t>
                         </w:r>
                       </w:p>
                     </w:txbxContent>

</xml_diff>

<commit_message>
Update LinkedIn URL, add LinkedIn button, and format footer text
</commit_message>
<xml_diff>
--- a/assets/Beni Makiese CV.docx
+++ b/assets/Beni Makiese CV.docx
@@ -2,6 +2,7 @@
 <file path=word/document.xml><?xml version="1.0" encoding="utf-8"?>
 <w:document xmlns:wpc="http://schemas.microsoft.com/office/word/2010/wordprocessingCanvas" xmlns:cx="http://schemas.microsoft.com/office/drawing/2014/chartex" xmlns:cx1="http://schemas.microsoft.com/office/drawing/2015/9/8/chartex" xmlns:cx2="http://schemas.microsoft.com/office/drawing/2015/10/21/chartex" xmlns:cx3="http://schemas.microsoft.com/office/drawing/2016/5/9/chartex" xmlns:cx4="http://schemas.microsoft.com/office/drawing/2016/5/10/chartex" xmlns:cx5="http://schemas.microsoft.com/office/drawing/2016/5/11/chartex" xmlns:cx6="http://schemas.microsoft.com/office/drawing/2016/5/12/chartex" xmlns:cx7="http://schemas.microsoft.com/office/drawing/2016/5/13/chartex" xmlns:cx8="http://schemas.microsoft.com/office/drawing/2016/5/14/chartex" xmlns:mc="http://schemas.openxmlformats.org/markup-compatibility/2006" xmlns:aink="http://schemas.microsoft.com/office/drawing/2016/ink" xmlns:am3d="http://schemas.microsoft.com/office/drawing/2017/model3d" xmlns:o="urn:schemas-microsoft-com:office:office" xmlns:oel="http://schemas.microsoft.com/office/2019/extlst" xmlns:r="http://schemas.openxmlformats.org/officeDocument/2006/relationships" xmlns:m="http://schemas.openxmlformats.org/officeDocument/2006/math" xmlns:v="urn:schemas-microsoft-com:vml" xmlns:wp14="http://schemas.microsoft.com/office/word/2010/wordprocessingDrawing" xmlns:wp="http://schemas.openxmlformats.org/drawingml/2006/wordprocessingDrawing" xmlns:w10="urn:schemas-microsoft-com:office:word" xmlns:w="http://schemas.openxmlformats.org/wordprocessingml/2006/main" xmlns:w14="http://schemas.microsoft.com/office/word/2010/wordml" xmlns:w15="http://schemas.microsoft.com/office/word/2012/wordml" xmlns:w16cex="http://schemas.microsoft.com/office/word/2018/wordml/cex" xmlns:w16cid="http://schemas.microsoft.com/office/word/2016/wordml/cid" xmlns:w16="http://schemas.microsoft.com/office/word/2018/wordml" xmlns:w16du="http://schemas.microsoft.com/office/word/2023/wordml/word16du" xmlns:w16sdtdh="http://schemas.microsoft.com/office/word/2020/wordml/sdtdatahash" xmlns:w16se="http://schemas.microsoft.com/office/word/2015/wordml/symex" xmlns:wpg="http://schemas.microsoft.com/office/word/2010/wordprocessingGroup" xmlns:wpi="http://schemas.microsoft.com/office/word/2010/wordprocessingInk" xmlns:wne="http://schemas.microsoft.com/office/word/2006/wordml" xmlns:wps="http://schemas.microsoft.com/office/word/2010/wordprocessingShape" mc:Ignorable="w14 w15 w16se w16cid w16 w16cex w16sdtdh w16du wp14">
   <w:body>
+    <w:bookmarkStart w:id="0" w:name="_Hlk132888078"/>
     <w:p>
       <w:pPr>
         <w:pStyle w:val="Corpsdetexte"/>
@@ -11,7 +12,6 @@
           <w:sz w:val="20"/>
         </w:rPr>
       </w:pPr>
-      <w:bookmarkStart w:id="0" w:name="_Hlk132888078"/>
       <w:r>
         <w:rPr>
           <w:rFonts w:ascii="Times New Roman"/>
@@ -112,80 +112,12 @@
       <w:r>
         <w:rPr>
           <w:noProof/>
-          <w14:ligatures w14:val="standardContextual"/>
-        </w:rPr>
-        <w:drawing>
-          <wp:anchor distT="0" distB="0" distL="114300" distR="114300" simplePos="0" relativeHeight="251719680" behindDoc="1" locked="0" layoutInCell="1" allowOverlap="1" wp14:anchorId="222D8828" wp14:editId="3AB6C6F1">
-            <wp:simplePos x="0" y="0"/>
-            <wp:positionH relativeFrom="column">
-              <wp:posOffset>-137160</wp:posOffset>
-            </wp:positionH>
-            <wp:positionV relativeFrom="paragraph">
-              <wp:posOffset>222250</wp:posOffset>
-            </wp:positionV>
-            <wp:extent cx="2167890" cy="2114550"/>
-            <wp:effectExtent l="0" t="0" r="3810" b="0"/>
-            <wp:wrapNone/>
-            <wp:docPr id="1255105460" name="Image 1"/>
-            <wp:cNvGraphicFramePr>
-              <a:graphicFrameLocks xmlns:a="http://schemas.openxmlformats.org/drawingml/2006/main" noChangeAspect="1"/>
-            </wp:cNvGraphicFramePr>
-            <a:graphic xmlns:a="http://schemas.openxmlformats.org/drawingml/2006/main">
-              <a:graphicData uri="http://schemas.openxmlformats.org/drawingml/2006/picture">
-                <pic:pic xmlns:pic="http://schemas.openxmlformats.org/drawingml/2006/picture">
-                  <pic:nvPicPr>
-                    <pic:cNvPr id="1255105460" name="Image 1255105460"/>
-                    <pic:cNvPicPr/>
-                  </pic:nvPicPr>
-                  <pic:blipFill rotWithShape="1">
-                    <a:blip r:embed="rId5" cstate="print">
-                      <a:extLst>
-                        <a:ext uri="{28A0092B-C50C-407E-A947-70E740481C1C}">
-                          <a14:useLocalDpi xmlns:a14="http://schemas.microsoft.com/office/drawing/2010/main" val="0"/>
-                        </a:ext>
-                      </a:extLst>
-                    </a:blip>
-                    <a:srcRect l="7585" t="8840" b="35766"/>
-                    <a:stretch/>
-                  </pic:blipFill>
-                  <pic:spPr bwMode="auto">
-                    <a:xfrm>
-                      <a:off x="0" y="0"/>
-                      <a:ext cx="2167890" cy="2114550"/>
-                    </a:xfrm>
-                    <a:prstGeom prst="roundRect">
-                      <a:avLst/>
-                    </a:prstGeom>
-                    <a:ln>
-                      <a:noFill/>
-                    </a:ln>
-                    <a:extLst>
-                      <a:ext uri="{53640926-AAD7-44D8-BBD7-CCE9431645EC}">
-                        <a14:shadowObscured xmlns:a14="http://schemas.microsoft.com/office/drawing/2010/main"/>
-                      </a:ext>
-                    </a:extLst>
-                  </pic:spPr>
-                </pic:pic>
-              </a:graphicData>
-            </a:graphic>
-            <wp14:sizeRelH relativeFrom="margin">
-              <wp14:pctWidth>0</wp14:pctWidth>
-            </wp14:sizeRelH>
-            <wp14:sizeRelV relativeFrom="margin">
-              <wp14:pctHeight>0</wp14:pctHeight>
-            </wp14:sizeRelV>
-          </wp:anchor>
-        </w:drawing>
-      </w:r>
-      <w:r>
-        <w:rPr>
-          <w:noProof/>
           <w:sz w:val="20"/>
         </w:rPr>
         <mc:AlternateContent>
           <mc:Choice Requires="wps">
             <w:drawing>
-              <wp:anchor distT="45720" distB="45720" distL="114300" distR="114300" simplePos="0" relativeHeight="251644928" behindDoc="0" locked="0" layoutInCell="1" allowOverlap="1" wp14:anchorId="0B10C7BD" wp14:editId="2375B7D7">
+              <wp:anchor distT="45720" distB="45720" distL="114300" distR="114300" simplePos="0" relativeHeight="251644928" behindDoc="0" locked="0" layoutInCell="1" allowOverlap="1" wp14:anchorId="0B10C7BD" wp14:editId="3671FDB4">
                 <wp:simplePos x="0" y="0"/>
                 <wp:positionH relativeFrom="column">
                   <wp:posOffset>2252329</wp:posOffset>
@@ -377,6 +309,74 @@
       <w:r>
         <w:rPr>
           <w:noProof/>
+          <w14:ligatures w14:val="standardContextual"/>
+        </w:rPr>
+        <w:drawing>
+          <wp:anchor distT="0" distB="0" distL="114300" distR="114300" simplePos="0" relativeHeight="251719680" behindDoc="1" locked="0" layoutInCell="1" allowOverlap="1" wp14:anchorId="222D8828" wp14:editId="5C543FAF">
+            <wp:simplePos x="0" y="0"/>
+            <wp:positionH relativeFrom="column">
+              <wp:posOffset>-47626</wp:posOffset>
+            </wp:positionH>
+            <wp:positionV relativeFrom="paragraph">
+              <wp:posOffset>37465</wp:posOffset>
+            </wp:positionV>
+            <wp:extent cx="2082165" cy="2114550"/>
+            <wp:effectExtent l="0" t="0" r="0" b="0"/>
+            <wp:wrapNone/>
+            <wp:docPr id="1255105460" name="Image 1"/>
+            <wp:cNvGraphicFramePr>
+              <a:graphicFrameLocks xmlns:a="http://schemas.openxmlformats.org/drawingml/2006/main" noChangeAspect="1"/>
+            </wp:cNvGraphicFramePr>
+            <a:graphic xmlns:a="http://schemas.openxmlformats.org/drawingml/2006/main">
+              <a:graphicData uri="http://schemas.openxmlformats.org/drawingml/2006/picture">
+                <pic:pic xmlns:pic="http://schemas.openxmlformats.org/drawingml/2006/picture">
+                  <pic:nvPicPr>
+                    <pic:cNvPr id="1255105460" name="Image 1255105460"/>
+                    <pic:cNvPicPr/>
+                  </pic:nvPicPr>
+                  <pic:blipFill rotWithShape="1">
+                    <a:blip r:embed="rId5" cstate="print">
+                      <a:extLst>
+                        <a:ext uri="{28A0092B-C50C-407E-A947-70E740481C1C}">
+                          <a14:useLocalDpi xmlns:a14="http://schemas.microsoft.com/office/drawing/2010/main" val="0"/>
+                        </a:ext>
+                      </a:extLst>
+                    </a:blip>
+                    <a:srcRect l="7585" t="8840" b="35766"/>
+                    <a:stretch/>
+                  </pic:blipFill>
+                  <pic:spPr bwMode="auto">
+                    <a:xfrm>
+                      <a:off x="0" y="0"/>
+                      <a:ext cx="2082165" cy="2114550"/>
+                    </a:xfrm>
+                    <a:prstGeom prst="roundRect">
+                      <a:avLst/>
+                    </a:prstGeom>
+                    <a:ln>
+                      <a:noFill/>
+                    </a:ln>
+                    <a:extLst>
+                      <a:ext uri="{53640926-AAD7-44D8-BBD7-CCE9431645EC}">
+                        <a14:shadowObscured xmlns:a14="http://schemas.microsoft.com/office/drawing/2010/main"/>
+                      </a:ext>
+                    </a:extLst>
+                  </pic:spPr>
+                </pic:pic>
+              </a:graphicData>
+            </a:graphic>
+            <wp14:sizeRelH relativeFrom="margin">
+              <wp14:pctWidth>0</wp14:pctWidth>
+            </wp14:sizeRelH>
+            <wp14:sizeRelV relativeFrom="margin">
+              <wp14:pctHeight>0</wp14:pctHeight>
+            </wp14:sizeRelV>
+          </wp:anchor>
+        </w:drawing>
+      </w:r>
+      <w:r>
+        <w:rPr>
+          <w:noProof/>
           <w:sz w:val="20"/>
         </w:rPr>
         <mc:AlternateContent>
@@ -489,6 +489,24 @@
                                 <w:szCs w:val="28"/>
                               </w:rPr>
                             </w:pPr>
+                            <w:r>
+                              <w:rPr>
+                                <w:color w:val="A6A6A6" w:themeColor="background1" w:themeShade="A6"/>
+                                <w:sz w:val="20"/>
+                                <w:szCs w:val="28"/>
+                              </w:rPr>
+                              <w:t>LinkedIn/</w:t>
+                            </w:r>
+                            <w:proofErr w:type="spellStart"/>
+                            <w:r>
+                              <w:rPr>
+                                <w:color w:val="A6A6A6" w:themeColor="background1" w:themeShade="A6"/>
+                                <w:sz w:val="20"/>
+                                <w:szCs w:val="28"/>
+                              </w:rPr>
+                              <w:t>beni-makiese</w:t>
+                            </w:r>
+                            <w:proofErr w:type="spellEnd"/>
                           </w:p>
                         </w:txbxContent>
                       </wps:txbx>
@@ -580,6 +598,24 @@
                           <w:szCs w:val="28"/>
                         </w:rPr>
                       </w:pPr>
+                      <w:r>
+                        <w:rPr>
+                          <w:color w:val="A6A6A6" w:themeColor="background1" w:themeShade="A6"/>
+                          <w:sz w:val="20"/>
+                          <w:szCs w:val="28"/>
+                        </w:rPr>
+                        <w:t>LinkedIn/</w:t>
+                      </w:r>
+                      <w:proofErr w:type="spellStart"/>
+                      <w:r>
+                        <w:rPr>
+                          <w:color w:val="A6A6A6" w:themeColor="background1" w:themeShade="A6"/>
+                          <w:sz w:val="20"/>
+                          <w:szCs w:val="28"/>
+                        </w:rPr>
+                        <w:t>beni-makiese</w:t>
+                      </w:r>
+                      <w:proofErr w:type="spellEnd"/>
                     </w:p>
                   </w:txbxContent>
                 </v:textbox>

</xml_diff>